<commit_message>
Nouvelles photos de Clara (rendu smartphone réaliste) + fixes de contenu
- Régénère les 9 photos du profil Instagram de Clara dans un style photo
  de smartphone réaliste plutôt que le rendu IA trop lisse d'origine
  (lever de soleil, guitare, chaton, glace, lecture, concert, fleurs,
  gâteau, ciel étoilé à la campagne).
- Corrige un bug préexistant : le post "trop aimé jouer" (guitare)
  affichait par erreur une photo de scène/rockstar (concert.png) ;
  ajoute images_clara/guitare.png dédiée et met à jour les deux HTML
  (FR/EN) pour pointer dessus. concert.png accueille maintenant la
  nouvelle photo de la chanteuse préférée de Clara.
- Divers fixes de contenu et de mécaniques de jeu (Partie 1, 2, 3) et
  mise à jour des documents partenaires.
</commit_message>
<xml_diff>
--- a/doc_textes_partenaires.docx
+++ b/doc_textes_partenaires.docx
@@ -42,7 +42,7 @@
           <w:color w:val="666666"/>
           <w:sz w:val="21"/>
         </w:rPr>
-        <w:t>Textes complets — Parties 1, 2, 3 et 4</w:t>
+        <w:t>Textes complets - Parties 1, 2, 3 et 4</w:t>
         <w:br/>
         <w:t>Document à destination des partenaires</w:t>
       </w:r>
@@ -58,7 +58,7 @@
           <w:color w:val="999999"/>
           <w:sz w:val="16"/>
         </w:rPr>
-        <w:t>Version du 10 septembre 2026  ·  Usage interne</w:t>
+        <w:t>Version du 14 septembre 2026  ·  Usage interne</w:t>
       </w:r>
     </w:p>
     <w:p>
@@ -84,7 +84,7 @@
         <w:rPr>
           <w:sz w:val="21"/>
         </w:rPr>
-        <w:t>Retrouver Clara est un jeu pédagogique destiné aux collégiens sur le thème du harcèlement scolaire et de son prolongement en ligne. Le joueur incarne Léo — ou Léa, au choix — un ami de Clara, quatorze ans, qui ne vient plus au collège depuis cinq jours. En traversant quatre scènes, il reconstitue ce qu'elle a vécu et apprend à lui parler.</w:t>
+        <w:t>Retrouver Clara est un jeu pédagogique destiné aux collégiens sur le thème du harcèlement scolaire et de son prolongement en ligne. Le joueur incarne Léo - ou Léa, au choix - un ami de Clara, quatorze ans, qui ne vient plus au collège depuis cinq jours. En traversant quatre scènes, il reconstitue ce qu'elle a vécu et apprend à lui parler.</w:t>
       </w:r>
     </w:p>
     <w:p>
@@ -697,7 +697,7 @@
           <w:color w:val="2A7A50"/>
           <w:sz w:val="19"/>
         </w:rPr>
-        <w:t>Je dois être le plus honnête possible, et le plus sincère — c'est ma seule chance qu'elle m'aide.</w:t>
+        <w:t>Je dois être le plus honnête possible, et le plus sincère - c'est ma seule chance qu'elle m'aide.</w:t>
       </w:r>
     </w:p>
     <w:p>
@@ -2779,7 +2779,7 @@
         <w:rPr>
           <w:sz w:val="21"/>
         </w:rPr>
-        <w:t>Oui ! c'est chez sa tante, à la campagne. C'est là qu'elle est, bravo ! Sa tante travaille dans un restaurant — voici le numéro : 04 54 78 95 32</w:t>
+        <w:t>Oui ! c'est chez sa tante, à la campagne. C'est là qu'elle est, bravo ! Sa tante travaille dans un restaurant - voici le numéro : 04 54 78 95 32</w:t>
       </w:r>
     </w:p>
     <w:p>
@@ -2848,7 +2848,7 @@
         <w:rPr>
           <w:sz w:val="19"/>
         </w:rPr>
-        <w:t>Depuis plusieurs semaines, Clara laissait son téléphone retourné, ignorait ses notifications — même celles d'Inès.</w:t>
+        <w:t>Depuis plusieurs semaines, Clara laissait son téléphone retourné, ignorait ses notifications - même celles d'Inès.</w:t>
       </w:r>
     </w:p>
     <w:p>
@@ -2904,7 +2904,7 @@
         <w:rPr>
           <w:sz w:val="19"/>
         </w:rPr>
-        <w:t>Même sa meilleure amie n'a pas eu les détails. Clara voulait protéger Inès — ou avait trop honte pour en parler.</w:t>
+        <w:t>Même sa meilleure amie n'a pas eu les détails. Clara voulait protéger Inès - ou avait trop honte pour en parler.</w:t>
       </w:r>
     </w:p>
     <w:p>
@@ -5864,7 +5864,7 @@
           <w:color w:val="444444"/>
           <w:sz w:val="20"/>
         </w:rPr>
-        <w:t>JOURNAL DE CLARA (SE DÉBLOQUE À SIX TYPES IDENTIFIÉS)</w:t>
+        <w:t>MESSAGE DE KEVIN (SE DÉBLOQUE À SIX TYPES IDENTIFIÉS)</w:t>
       </w:r>
     </w:p>
     <w:p>
@@ -5876,10 +5876,10 @@
         <w:rPr>
           <w:rFonts w:ascii="Arial Narrow" w:hAnsi="Arial Narrow"/>
           <w:b/>
-          <w:color w:val="6A1A2A"/>
+          <w:color w:val="555555"/>
           <w:sz w:val="17"/>
         </w:rPr>
-        <w:t xml:space="preserve">Clara       </w:t>
+        <w:t xml:space="preserve">Kevin       </w:t>
       </w:r>
       <w:r>
         <w:rPr>
@@ -5891,7 +5891,7 @@
         <w:rPr>
           <w:sz w:val="21"/>
         </w:rPr>
-        <w:t>c'est horrible...</w:t>
+        <w:t>Je suis désolé, je ne pensais pas que ça irait aussi loin</w:t>
       </w:r>
     </w:p>
     <w:p>
@@ -5903,10 +5903,10 @@
         <w:rPr>
           <w:rFonts w:ascii="Arial Narrow" w:hAnsi="Arial Narrow"/>
           <w:b/>
-          <w:color w:val="6A1A2A"/>
+          <w:color w:val="555555"/>
           <w:sz w:val="17"/>
         </w:rPr>
-        <w:t xml:space="preserve">Clara       </w:t>
+        <w:t xml:space="preserve">Kevin       </w:t>
       </w:r>
       <w:r>
         <w:rPr>
@@ -5918,7 +5918,7 @@
         <w:rPr>
           <w:sz w:val="21"/>
         </w:rPr>
-        <w:t>j'ai découvert qu'ils ont fait un groupe sur moi</w:t>
+        <w:t>mais si tu veux voir ce qu'ils racontent sur toi, c'est ici</w:t>
       </w:r>
     </w:p>
     <w:p>
@@ -5930,10 +5930,10 @@
         <w:rPr>
           <w:rFonts w:ascii="Arial Narrow" w:hAnsi="Arial Narrow"/>
           <w:b/>
-          <w:color w:val="6A1A2A"/>
+          <w:color w:val="555555"/>
           <w:sz w:val="17"/>
         </w:rPr>
-        <w:t xml:space="preserve">Clara       </w:t>
+        <w:t xml:space="preserve">Kevin       </w:t>
       </w:r>
       <w:r>
         <w:rPr>
@@ -5945,88 +5945,7 @@
         <w:rPr>
           <w:sz w:val="21"/>
         </w:rPr>
-        <w:t>un groupe secret où ils coordonnent tout ce qui m'arrive</w:t>
-      </w:r>
-    </w:p>
-    <w:p>
-      <w:pPr>
-        <w:spacing w:before="0" w:after="30" w:line="276" w:lineRule="auto"/>
-        <w:keepLines/>
-      </w:pPr>
-      <w:r>
-        <w:rPr>
-          <w:rFonts w:ascii="Arial Narrow" w:hAnsi="Arial Narrow"/>
-          <w:b/>
-          <w:color w:val="6A1A2A"/>
-          <w:sz w:val="17"/>
-        </w:rPr>
-        <w:t xml:space="preserve">Clara       </w:t>
-      </w:r>
-      <w:r>
-        <w:rPr>
-          <w:sz w:val="16"/>
-        </w:rPr>
-        <w:t xml:space="preserve">  </w:t>
-      </w:r>
-      <w:r>
-        <w:rPr>
-          <w:sz w:val="21"/>
-        </w:rPr>
-        <w:t>je sais même pas comment je l'ai appris</w:t>
-      </w:r>
-    </w:p>
-    <w:p>
-      <w:pPr>
-        <w:spacing w:before="0" w:after="30" w:line="276" w:lineRule="auto"/>
-        <w:keepLines/>
-      </w:pPr>
-      <w:r>
-        <w:rPr>
-          <w:rFonts w:ascii="Arial Narrow" w:hAnsi="Arial Narrow"/>
-          <w:b/>
-          <w:color w:val="6A1A2A"/>
-          <w:sz w:val="17"/>
-        </w:rPr>
-        <w:t xml:space="preserve">Clara       </w:t>
-      </w:r>
-      <w:r>
-        <w:rPr>
-          <w:sz w:val="16"/>
-        </w:rPr>
-        <w:t xml:space="preserve">  </w:t>
-      </w:r>
-      <w:r>
-        <w:rPr>
-          <w:sz w:val="21"/>
-        </w:rPr>
-        <w:t>et je peux pas y entrer. je peux rien prouver.</w:t>
-      </w:r>
-    </w:p>
-    <w:p>
-      <w:pPr>
-        <w:spacing w:before="0" w:after="30" w:line="276" w:lineRule="auto"/>
-        <w:keepLines/>
-      </w:pPr>
-      <w:r>
-        <w:rPr>
-          <w:rFonts w:ascii="Arial Narrow" w:hAnsi="Arial Narrow"/>
-          <w:b/>
-          <w:color w:val="6A1A2A"/>
-          <w:sz w:val="17"/>
-        </w:rPr>
-        <w:t xml:space="preserve">Clara       </w:t>
-      </w:r>
-      <w:r>
-        <w:rPr>
-          <w:sz w:val="16"/>
-        </w:rPr>
-        <w:t xml:space="preserve">  </w:t>
-      </w:r>
-      <w:r>
-        <w:rPr>
-          <w:sz w:val="21"/>
-        </w:rPr>
-        <w:t>je sais pas quoi faire de ça</w:t>
+        <w:t>le groupe Whatsupp « les vrais 4B 🔥 », code 4827</w:t>
       </w:r>
     </w:p>
     <w:p>
@@ -6040,7 +5959,7 @@
           <w:color w:val="666666"/>
           <w:sz w:val="18"/>
         </w:rPr>
-        <w:t>Un bouton en bas du fil ouvre l'écran du code de l'exercice (4827), qui ouvre la Partie 3. Ce code est présenté comme un dispositif d'exercice : un groupe Whatsupp n'a pas de code d'accès, et Clara n'a jamais pu entrer dans celui-là.</w:t>
+        <w:t>Un bouton en bas du fil ouvre l'écran du code d'accès du groupe Whatsupp (4827), envoyé par Kevin, qui ouvre la Partie 3.</w:t>
       </w:r>
     </w:p>
     <w:p>
@@ -6073,7 +5992,7 @@
           <w:color w:val="2A4A7A"/>
           <w:sz w:val="19"/>
         </w:rPr>
-        <w:t>Photo 1 — lever de soleil ce matin 🌅</w:t>
+        <w:t>Photo 1 - lever de soleil ce matin 🌅</w:t>
       </w:r>
       <w:r>
         <w:rPr>
@@ -6094,7 +6013,7 @@
         <w:rPr>
           <w:sz w:val="19"/>
         </w:rPr>
-        <w:t>utilisateur_4729 — quelle qualite de photo lol</w:t>
+        <w:t>utilisateur_4729 - quelle qualite de photo lol</w:t>
       </w:r>
     </w:p>
     <w:p>
@@ -6107,7 +6026,7 @@
         <w:rPr>
           <w:sz w:val="19"/>
         </w:rPr>
-        <w:t>anonymous_x0 — ta photo elle est floue t'as meme pas de talent</w:t>
+        <w:t>anonymous_x0 - ta photo elle est floue t'as meme pas de talent</w:t>
       </w:r>
     </w:p>
     <w:p>
@@ -6120,7 +6039,7 @@
         <w:rPr>
           <w:sz w:val="19"/>
         </w:rPr>
-        <w:t>_noreply_ghost_ — elle est trop moche ta photo serieusement</w:t>
+        <w:t>_noreply_ghost_ - elle est trop moche ta photo serieusement</w:t>
       </w:r>
     </w:p>
     <w:p>
@@ -6139,7 +6058,7 @@
           <w:color w:val="2A4A7A"/>
           <w:sz w:val="19"/>
         </w:rPr>
-        <w:t>Photo 2 — trop aimer jouer 🎸🎵</w:t>
+        <w:t>Photo 2 - trop aimer jouer 🎸🎵</w:t>
       </w:r>
       <w:r>
         <w:rPr>
@@ -6160,7 +6079,7 @@
         <w:rPr>
           <w:sz w:val="19"/>
         </w:rPr>
-        <w:t>sarah.girard — MAIS depuis quand tu joues aussi bien</w:t>
+        <w:t>sarah.girard - MAIS depuis quand tu joues aussi bien</w:t>
       </w:r>
     </w:p>
     <w:p>
@@ -6173,7 +6092,7 @@
         <w:rPr>
           <w:sz w:val="19"/>
         </w:rPr>
-        <w:t>ines_l — la meme chanson depuis 3 semaines mdr mais j'adore</w:t>
+        <w:t>ines_l - la meme chanson depuis 3 semaines mdr mais j'adore</w:t>
       </w:r>
     </w:p>
     <w:p>
@@ -6186,7 +6105,7 @@
         <w:rPr>
           <w:sz w:val="19"/>
         </w:rPr>
-        <w:t>sarah.girard — tu joues au spectacle de fin d'annee stp</w:t>
+        <w:t>sarah.girard - tu joues au spectacle de fin d'annee stp</w:t>
       </w:r>
     </w:p>
     <w:p>
@@ -6205,7 +6124,7 @@
           <w:color w:val="2A4A7A"/>
           <w:sz w:val="19"/>
         </w:rPr>
-        <w:t>Photo 3 — mon chaton 🐱❤️</w:t>
+        <w:t>Photo 3 - mon chaton 🐱❤️</w:t>
       </w:r>
       <w:r>
         <w:rPr>
@@ -6226,7 +6145,7 @@
         <w:rPr>
           <w:sz w:val="19"/>
         </w:rPr>
-        <w:t>anon_colleg_real — meme ton chat a l'air aussi nul que toi</w:t>
+        <w:t>anon_colleg_real - meme ton chat a l'air aussi nul que toi</w:t>
       </w:r>
     </w:p>
     <w:p>
@@ -6239,7 +6158,7 @@
         <w:rPr>
           <w:sz w:val="19"/>
         </w:rPr>
-        <w:t>jevoustrouve — elle est trop moche ta photo</w:t>
+        <w:t>jevoustrouve - elle est trop moche ta photo</w:t>
       </w:r>
     </w:p>
     <w:p>
@@ -6258,7 +6177,7 @@
           <w:color w:val="2A4A7A"/>
           <w:sz w:val="19"/>
         </w:rPr>
-        <w:t>Photo 4 — glace du dimanche 🍦</w:t>
+        <w:t>Photo 4 - glace du dimanche 🍦</w:t>
       </w:r>
       <w:r>
         <w:rPr>
@@ -6279,7 +6198,7 @@
         <w:rPr>
           <w:sz w:val="19"/>
         </w:rPr>
-        <w:t>sansnom_2024 — et tu te demandes pourquoi t'as un probleme de poids</w:t>
+        <w:t>sansnom_2024 - et tu te demandes pourquoi t'as un probleme de poids</w:t>
       </w:r>
     </w:p>
     <w:p>
@@ -6292,7 +6211,7 @@
         <w:rPr>
           <w:sz w:val="19"/>
         </w:rPr>
-        <w:t>xx_nobody_xx — franchement t'as aucune honte de poster ca</w:t>
+        <w:t>xx_nobody_xx - franchement t'as aucune honte de poster ca</w:t>
       </w:r>
     </w:p>
     <w:p>
@@ -6305,7 +6224,7 @@
         <w:rPr>
           <w:sz w:val="19"/>
         </w:rPr>
-        <w:t>anonymous_x0 — mange encore t'inquiete</w:t>
+        <w:t>anonymous_x0 - mange encore t'inquiete</w:t>
       </w:r>
     </w:p>
     <w:p>
@@ -6324,7 +6243,7 @@
           <w:color w:val="2A4A7A"/>
           <w:sz w:val="19"/>
         </w:rPr>
-        <w:t>Photo 5 — lecture du soir 📚</w:t>
+        <w:t>Photo 5 - lecture du soir 📚</w:t>
       </w:r>
       <w:r>
         <w:rPr>
@@ -6345,7 +6264,7 @@
         <w:rPr>
           <w:sz w:val="19"/>
         </w:rPr>
-        <w:t>ines_l — t'es a quel tome la ??</w:t>
+        <w:t>ines_l - t'es a quel tome la ??</w:t>
       </w:r>
     </w:p>
     <w:p>
@@ -6358,7 +6277,7 @@
         <w:rPr>
           <w:sz w:val="19"/>
         </w:rPr>
-        <w:t>sarah.girard — tu me le pretes quand t'as fini</w:t>
+        <w:t>sarah.girard - tu me le pretes quand t'as fini</w:t>
       </w:r>
     </w:p>
     <w:p>
@@ -6377,7 +6296,7 @@
           <w:color w:val="2A4A7A"/>
           <w:sz w:val="19"/>
         </w:rPr>
-        <w:t>Photo 6 — concert ce soir 🎤🔥</w:t>
+        <w:t>Photo 6 - concert ce soir 🎤🔥</w:t>
       </w:r>
       <w:r>
         <w:rPr>
@@ -6398,7 +6317,7 @@
         <w:rPr>
           <w:sz w:val="19"/>
         </w:rPr>
-        <w:t>vrai_info_colleg — quoi ? tu aimes cette artiste ? t'es nulle ma pauvre fille</w:t>
+        <w:t>vrai_info_colleg - quoi ? tu aimes cette artiste ? t'es nulle ma pauvre fille</w:t>
       </w:r>
     </w:p>
     <w:p>
@@ -6411,7 +6330,7 @@
         <w:rPr>
           <w:sz w:val="19"/>
         </w:rPr>
-        <w:t>user_fake8847 — t'aurais pas du y aller ca se voit que t'es pas a ta place</w:t>
+        <w:t>user_fake8847 - t'aurais pas du y aller ca se voit que t'es pas a ta place</w:t>
       </w:r>
     </w:p>
     <w:p>
@@ -6424,7 +6343,7 @@
         <w:rPr>
           <w:sz w:val="19"/>
         </w:rPr>
-        <w:t>0000_mask_0000 — les gens autour de toi dans la foule ils devaient etre contents lol</w:t>
+        <w:t>0000_mask_0000 - les gens autour de toi dans la foule ils devaient etre contents lol</w:t>
       </w:r>
     </w:p>
     <w:p>
@@ -6443,7 +6362,7 @@
           <w:color w:val="2A4A7A"/>
           <w:sz w:val="19"/>
         </w:rPr>
-        <w:t>Photo 7 — fleurs du marche 🌸</w:t>
+        <w:t>Photo 7 - fleurs du marche 🌸</w:t>
       </w:r>
       <w:r>
         <w:rPr>
@@ -6464,7 +6383,7 @@
         <w:rPr>
           <w:sz w:val="19"/>
         </w:rPr>
-        <w:t>dark_mode_user — meme les fleurs ont l'air de vouloir partir</w:t>
+        <w:t>dark_mode_user - meme les fleurs ont l'air de vouloir partir</w:t>
       </w:r>
     </w:p>
     <w:p>
@@ -6477,7 +6396,7 @@
         <w:rPr>
           <w:sz w:val="19"/>
         </w:rPr>
-        <w:t>fantome_reseau — des fleurs ? personne t'en offrira jamais lol</w:t>
+        <w:t>fantome_reseau - des fleurs ? personne t'en offrira jamais lol</w:t>
       </w:r>
     </w:p>
     <w:p>
@@ -6496,7 +6415,7 @@
           <w:color w:val="2A4A7A"/>
           <w:sz w:val="19"/>
         </w:rPr>
-        <w:t>Photo 8 — gateau d'anniversaire 🎂</w:t>
+        <w:t>Photo 8 - gateau d'anniversaire 🎂</w:t>
       </w:r>
       <w:r>
         <w:rPr>
@@ -6517,7 +6436,7 @@
         <w:rPr>
           <w:sz w:val="19"/>
         </w:rPr>
-        <w:t>anon_colleg_real — personne etait la pour ton anniversaire c'est ca ?</w:t>
+        <w:t>anon_colleg_real - personne etait la pour ton anniversaire c'est ca ?</w:t>
       </w:r>
     </w:p>
     <w:p>
@@ -6530,7 +6449,7 @@
         <w:rPr>
           <w:sz w:val="19"/>
         </w:rPr>
-        <w:t>sansnom_2024 — tu l'as mange toute seule le gateau ?</w:t>
+        <w:t>sansnom_2024 - tu l'as mange toute seule le gateau ?</w:t>
       </w:r>
     </w:p>
     <w:p>
@@ -6543,7 +6462,7 @@
         <w:rPr>
           <w:sz w:val="19"/>
         </w:rPr>
-        <w:t>xx_nobody_xx — triste comme fete</w:t>
+        <w:t>xx_nobody_xx - triste comme fete</w:t>
       </w:r>
     </w:p>
     <w:p>
@@ -6562,7 +6481,7 @@
           <w:color w:val="2A4A7A"/>
           <w:sz w:val="19"/>
         </w:rPr>
-        <w:t>Photo 9 — nuit etoilee 🌙</w:t>
+        <w:t>Photo 9 - nuit etoilee 🌙</w:t>
       </w:r>
       <w:r>
         <w:rPr>
@@ -6583,7 +6502,7 @@
         <w:rPr>
           <w:sz w:val="19"/>
         </w:rPr>
-        <w:t>truth_teller_99 — 0 likes en 3 heures c'est un message clara</w:t>
+        <w:t>truth_teller_99 - 0 likes en 3 heures c'est un message clara</w:t>
       </w:r>
     </w:p>
     <w:p>
@@ -6596,7 +6515,7 @@
         <w:rPr>
           <w:sz w:val="19"/>
         </w:rPr>
-        <w:t>utilisateur_4729 — meme le ciel il veut pas de toi</w:t>
+        <w:t>utilisateur_4729 - meme le ciel il veut pas de toi</w:t>
       </w:r>
     </w:p>
     <w:p>
@@ -6609,7 +6528,7 @@
         <w:rPr>
           <w:sz w:val="19"/>
         </w:rPr>
-        <w:t>_noreply_ghost_ — t'aurais mieux fait de dormir que de poster ca</w:t>
+        <w:t>_noreply_ghost_ - t'aurais mieux fait de dormir que de poster ca</w:t>
       </w:r>
     </w:p>
     <w:p>
@@ -6779,7 +6698,7 @@
         <w:rPr>
           <w:sz w:val="21"/>
         </w:rPr>
-        <w:t>"Clara est-elle la personne la plus nulle du collège ?" — Quel type de cyberharcèlement est-ce ?</w:t>
+        <w:t>"Clara est-elle la personne la plus nulle du collège ?" - Quel type de cyberharcèlement est-ce ?</w:t>
       </w:r>
     </w:p>
     <w:p>
@@ -6886,7 +6805,7 @@
         <w:rPr>
           <w:sz w:val="21"/>
         </w:rPr>
-        <w:t>"On parle de toi en mal mais je ne te dirai pas ce qu'on dit." — C'est quoi ?</w:t>
+        <w:t>"On parle de toi en mal mais je ne te dirai pas ce qu'on dit." - C'est quoi ?</w:t>
       </w:r>
     </w:p>
     <w:p>
@@ -6993,7 +6912,7 @@
         <w:rPr>
           <w:sz w:val="21"/>
         </w:rPr>
-        <w:t>"Supprime ton compte, personne ne le remarquerait." — Quel mécanisme est à l'œuvre ?</w:t>
+        <w:t>"Supprime ton compte, personne ne le remarquerait." - Quel mécanisme est à l'œuvre ?</w:t>
       </w:r>
     </w:p>
     <w:p>
@@ -7235,7 +7154,7 @@
           <w:color w:val="2A7A50"/>
           <w:sz w:val="20"/>
         </w:rPr>
-        <w:t>Du body shaming — harcèlement ciblant l'apparence physique</w:t>
+        <w:t>Du body shaming - harcèlement ciblant l'apparence physique</w:t>
       </w:r>
     </w:p>
     <w:p>
@@ -7539,7 +7458,7 @@
         <w:rPr>
           <w:sz w:val="21"/>
         </w:rPr>
-        <w:t>Faire une capture d'écran d'abord — une fois le compte signalé ou bloqué, on perd l'accès aux messages, et ce sont eux la preuve.</w:t>
+        <w:t>Faire une capture d'écran d'abord - une fois le compte signalé ou bloqué, on perd l'accès aux messages, et ce sont eux la preuve.</w:t>
       </w:r>
     </w:p>
     <w:p>
@@ -7591,7 +7510,7 @@
         <w:rPr>
           <w:sz w:val="21"/>
         </w:rPr>
-        <w:t>Compte signalé. Clara aurait pu le faire dès le premier message — personne ne le lui avait dit.</w:t>
+        <w:t>Compte signalé. Clara aurait pu le faire dès le premier message - personne ne le lui avait dit.</w:t>
       </w:r>
     </w:p>
     <w:p>
@@ -7620,7 +7539,7 @@
           <w:color w:val="F0ECE4"/>
           <w:sz w:val="34"/>
         </w:rPr>
-        <w:t>Le groupe Whatsupp secret — « les vrais 4B 🔥 »</w:t>
+        <w:t>Le groupe Whatsupp secret - « les vrais 4B 🔥 »</w:t>
       </w:r>
     </w:p>
     <w:p>
@@ -7661,7 +7580,7 @@
         <w:t>Je vais observer un groupe secret dont Clara ne fait pas partie.</w:t>
         <w:br/>
         <w:br/>
-        <w:t>Ces échanges montrent comment le harcèlement se coordonne en coulisse — comment des comptes anonymes sont créés pour attaquer et comment les agressions sont organisées collectivement.</w:t>
+        <w:t>Ces échanges montrent comment le harcèlement se coordonne en coulisse - comment des comptes anonymes sont créés pour attaquer et comment les agressions sont organisées collectivement.</w:t>
       </w:r>
     </w:p>
     <w:p>
@@ -7673,7 +7592,7 @@
         <w:rPr>
           <w:sz w:val="21"/>
         </w:rPr>
-        <w:t>Ils écrivent à Clara depuis des comptes anonymes — et ici, entre eux, ils disent lesquels.</w:t>
+        <w:t>Ils écrivent à Clara depuis des comptes anonymes - et ici, entre eux, ils disent lesquels.</w:t>
         <w:br/>
         <w:br/>
         <w:t>À chaque fois qu'un compte est nommé, appuie dessus : je saurai qui se cache derrière. Clara, elle, ne le saura jamais.</w:t>
@@ -7707,7 +7626,7 @@
           <w:color w:val="666666"/>
           <w:sz w:val="18"/>
         </w:rPr>
-        <w:t>Clara ne peut pas le savoir. Toi si — parce que tu lis un groupe où tu n'es pas.</w:t>
+        <w:t>Clara ne peut pas le savoir. Toi si - parce que tu lis un groupe où tu n'es pas.</w:t>
       </w:r>
     </w:p>
     <w:p>
@@ -8742,7 +8661,7 @@
           <w:color w:val="2A7A50"/>
           <w:sz w:val="20"/>
         </w:rPr>
-        <w:t>La pression du groupe peut réduire au silence même celui qui doute — c'est un mécanisme clé du harcèlement collectif</w:t>
+        <w:t>La pression du groupe peut réduire au silence même celui qui doute - c'est un mécanisme clé du harcèlement collectif</w:t>
       </w:r>
     </w:p>
     <w:p>
@@ -8786,7 +8705,7 @@
           <w:color w:val="666666"/>
           <w:sz w:val="19"/>
         </w:rPr>
-        <w:t>Le harcèlement de groupe fonctionne parce que la pression sociale étouffe les voix discordantes. Kevin doute, mais il se conforme pour ne pas être exclu à son tour. Pendant ce temps, Clara fait face à une masse entière — ce qui rend son isolement total et son sentiment d'injustice encore plus fort.</w:t>
+        <w:t>Le harcèlement de groupe fonctionne parce que la pression sociale étouffe les voix discordantes. Kevin doute, mais il se conforme pour ne pas être exclu à son tour. Pendant ce temps, Clara fait face à une masse entière - ce qui rend son isolement total et son sentiment d'injustice encore plus fort.</w:t>
       </w:r>
     </w:p>
     <w:p>
@@ -9055,7 +8974,7 @@
           <w:color w:val="666666"/>
           <w:sz w:val="19"/>
         </w:rPr>
-        <w:t>Les comptes anonymes servent à masquer l'identité des harceleurs tout en donnant l'impression que les attaques viennent de partout. Clara ne peut pas identifier ses agresseurs, les bloquer efficacement, ni prouver qui fait quoi. L'angoisse devient permanente car la menace semble surgir de nulle part — même chez elle, même la nuit.</w:t>
+        <w:t>Les comptes anonymes servent à masquer l'identité des harceleurs tout en donnant l'impression que les attaques viennent de partout. Clara ne peut pas identifier ses agresseurs, les bloquer efficacement, ni prouver qui fait quoi. L'angoisse devient permanente car la menace semble surgir de nulle part - même chez elle, même la nuit.</w:t>
       </w:r>
     </w:p>
     <w:p>
@@ -9070,7 +8989,7 @@
           <w:color w:val="999999"/>
           <w:sz w:val="17"/>
         </w:rPr>
-        <w:t>Lendemain — 09h14</w:t>
+        <w:t>Lendemain - 09h14</w:t>
       </w:r>
     </w:p>
     <w:p>
@@ -9724,7 +9643,7 @@
         <w:rPr>
           <w:sz w:val="21"/>
         </w:rPr>
-        <w:t>recevait des messages anonymes la nuit — ils sont dans ce groupe.</w:t>
+        <w:t>recevait des messages anonymes la nuit - ils sont dans ce groupe.</w:t>
       </w:r>
     </w:p>
     <w:p>
@@ -9744,7 +9663,7 @@
         <w:rPr>
           <w:sz w:val="21"/>
         </w:rPr>
-        <w:t>voyait ses commentaires envahis — ils les ont organisés ici.</w:t>
+        <w:t>voyait ses commentaires envahis - ils les ont organisés ici.</w:t>
       </w:r>
     </w:p>
     <w:p>
@@ -9764,7 +9683,7 @@
         <w:rPr>
           <w:sz w:val="21"/>
         </w:rPr>
-        <w:t>pensait que « tout le monde » la détestait — ils l'ont fabriqué ensemble.</w:t>
+        <w:t>pensait que « tout le monde » la détestait - ils l'ont fabriqué ensemble.</w:t>
       </w:r>
     </w:p>
     <w:p>
@@ -9784,7 +9703,7 @@
         <w:rPr>
           <w:sz w:val="21"/>
         </w:rPr>
-        <w:t>n'osait plus poster — c'était leur objectif.</w:t>
+        <w:t>n'osait plus poster - c'était leur objectif.</w:t>
       </w:r>
     </w:p>
     <w:p>
@@ -9858,7 +9777,7 @@
         <w:rPr>
           <w:sz w:val="19"/>
         </w:rPr>
-        <w:t>Kevin hésite mais se conforme pour ne pas être exclu. Quand personne n'ose s'opposer, tout le groupe devient complice — même ceux qui doutent. La victime fait face à une masse, pas à un individu.</w:t>
+        <w:t>Kevin hésite mais se conforme pour ne pas être exclu. Quand personne n'ose s'opposer, tout le groupe devient complice - même ceux qui doutent. La victime fait face à une masse, pas à un individu.</w:t>
       </w:r>
     </w:p>
     <w:p>
@@ -9942,7 +9861,7 @@
         <w:rPr>
           <w:sz w:val="19"/>
         </w:rPr>
-        <w:t>En envoyant des messages après minuit, le groupe s'assure que Clara ne peut plus se réfugier chez elle. Le harcèlement suit la victime partout — même dans son lit, même la nuit.</w:t>
+        <w:t>En envoyant des messages après minuit, le groupe s'assure que Clara ne peut plus se réfugier chez elle. Le harcèlement suit la victime partout - même dans son lit, même la nuit.</w:t>
       </w:r>
     </w:p>
     <w:p>
@@ -9968,7 +9887,7 @@
         <w:rPr>
           <w:sz w:val="21"/>
         </w:rPr>
-        <w:t>Kevin a douté quatre fois. « On va un peu trop loin là. » « C'est peut-être grave. » « Ça fait 2 jours qu'on la voit plus. » Puis « … ». À chaque fois on lui a coupé la parole, et à chaque fois il s'est tu.</w:t>
+        <w:t>Kevin a douté quatre fois. « On va un peu trop loin là. » « C'est peut-être grave. » « Ça fait 2 jours qu'on la voit plus. » Puis « … ». À chaque fois on lui a coupé la parole, et à chaque fois il s'est tu. Il a fini par écrire à Clara, mais trop tard : elle était déjà partie.</w:t>
       </w:r>
     </w:p>
     <w:p>
@@ -9988,7 +9907,7 @@
         <w:rPr>
           <w:sz w:val="21"/>
         </w:rPr>
-        <w:t>Écrire à Clara en privé, une seule phrase. Il n'avait pas besoin d'affronter le groupe : il suffisait qu'elle ne se croie plus seule.</w:t>
+        <w:t>Écrire à Clara en privé dès le premier doute, une seule phrase. Il n'avait pas besoin d'affronter le groupe : il suffisait qu'elle ne se croie plus seule.</w:t>
       </w:r>
     </w:p>
     <w:p>
@@ -10088,7 +10007,7 @@
         <w:rPr>
           <w:sz w:val="21"/>
         </w:rPr>
-        <w:t>Relis le groupe : à aucun moment ils ne le disent. La seule justification qui revient est « elle l'a bien cherché ». Il n'y a pas de raison — et chercher laquelle serait déjà donner tort à Clara.</w:t>
+        <w:t>Relis le groupe : à aucun moment ils ne le disent. La seule justification qui revient est « elle l'a bien cherché ». Il n'y a pas de raison - et chercher laquelle serait déjà donner tort à Clara.</w:t>
       </w:r>
     </w:p>
     <w:p>
@@ -10131,7 +10050,7 @@
         </w:rPr>
         <w:t>Clara ne vient plus au collège depuis cinq jours. Elle s'est réfugiée chez sa tante, à la campagne.</w:t>
         <w:br/>
-        <w:t>Tu es Léo, son ami. Pour parler à Clara, tu dois d'abord convaincre sa tante que tu es digne de confiance — et que tu es vraiment là pour l'aider.</w:t>
+        <w:t>Tu es Léo, son ami. Pour parler à Clara, tu dois d'abord convaincre sa tante que tu es digne de confiance - et que tu es vraiment là pour l'aider.</w:t>
       </w:r>
     </w:p>
     <w:p>
@@ -10245,7 +10164,7 @@
           <w:color w:val="444444"/>
           <w:sz w:val="20"/>
         </w:rPr>
-        <w:t>PHASE 1 — LA TANTE — QUESTION 1 / 3</w:t>
+        <w:t>PHASE 1 - LA TANTE - QUESTION 1 / 3</w:t>
       </w:r>
     </w:p>
     <w:p>
@@ -10453,7 +10372,7 @@
         <w:rPr>
           <w:sz w:val="20"/>
         </w:rPr>
-        <w:t>« Je comprends. Mais c'est important — ça ne prendra pas longtemps. »</w:t>
+        <w:t>« Je comprends. Mais c'est important - ça ne prendra pas longtemps. »</w:t>
       </w:r>
       <w:r>
         <w:br/>
@@ -10672,7 +10591,7 @@
           <w:color w:val="444444"/>
           <w:sz w:val="20"/>
         </w:rPr>
-        <w:t>PHASE 1 — LA TANTE — QUESTION 2 / 3</w:t>
+        <w:t>PHASE 1 - LA TANTE - QUESTION 2 / 3</w:t>
       </w:r>
     </w:p>
     <w:p>
@@ -11018,7 +10937,7 @@
           <w:color w:val="444444"/>
           <w:sz w:val="20"/>
         </w:rPr>
-        <w:t>PHASE 1 — LA TANTE — QUESTION 3 / 3</w:t>
+        <w:t>PHASE 1 - LA TANTE - QUESTION 3 / 3</w:t>
       </w:r>
     </w:p>
     <w:p>
@@ -11214,7 +11133,7 @@
           <w:color w:val="999999"/>
           <w:sz w:val="17"/>
         </w:rPr>
-        <w:t>Tu parles de toi et de ton plan — pas d'elle.</w:t>
+        <w:t>Tu parles de toi et de ton plan - pas d'elle.</w:t>
       </w:r>
       <w:r>
         <w:br/>
@@ -11407,7 +11326,7 @@
           <w:color w:val="444444"/>
           <w:sz w:val="20"/>
         </w:rPr>
-        <w:t>PHASE 2 — CLARA — QUESTION 1 / 4</w:t>
+        <w:t>PHASE 2 - CLARA - QUESTION 1 / 4</w:t>
       </w:r>
     </w:p>
     <w:p>
@@ -11880,7 +11799,7 @@
           <w:color w:val="444444"/>
           <w:sz w:val="20"/>
         </w:rPr>
-        <w:t>PHASE 2 — CLARA — QUESTION 2 / 4</w:t>
+        <w:t>PHASE 2 - CLARA - QUESTION 2 / 4</w:t>
       </w:r>
     </w:p>
     <w:p>
@@ -12114,7 +12033,7 @@
           <w:color w:val="444444"/>
           <w:sz w:val="20"/>
         </w:rPr>
-        <w:t>PHASE 2 — CLARA — QUESTION 3 / 4</w:t>
+        <w:t>PHASE 2 - CLARA - QUESTION 3 / 4</w:t>
       </w:r>
     </w:p>
     <w:p>
@@ -12241,7 +12160,7 @@
         <w:rPr>
           <w:sz w:val="20"/>
         </w:rPr>
-        <w:t>« Non. Ce que tu voyais, c'est leurs mensonges — pas toi. »</w:t>
+        <w:t>« Non. Ce que tu voyais, c'est leurs mensonges - pas toi. »</w:t>
       </w:r>
       <w:r>
         <w:br/>
@@ -12344,7 +12263,7 @@
           <w:color w:val="444444"/>
           <w:sz w:val="20"/>
         </w:rPr>
-        <w:t>PHASE 2 — CLARA — QUESTION 4 / 4</w:t>
+        <w:t>PHASE 2 - CLARA - QUESTION 4 / 4</w:t>
       </w:r>
     </w:p>
     <w:p>
@@ -12484,7 +12403,7 @@
           <w:color w:val="999999"/>
           <w:sz w:val="17"/>
         </w:rPr>
-        <w:t>Tu lui montres que chercher de l'aide adulte, c'est un acte de courage — pas une faiblesse.</w:t>
+        <w:t>Tu lui montres que chercher de l'aide adulte, c'est un acte de courage - pas une faiblesse.</w:t>
       </w:r>
       <w:r>
         <w:br/>
@@ -12531,7 +12450,7 @@
         <w:rPr>
           <w:sz w:val="20"/>
         </w:rPr>
-        <w:t>« Tu n'as pas à régler ça toute seule. Si tu veux, je peux être là quand tu en parles à quelqu'un — n'importe quel adulte de confiance. »</w:t>
+        <w:t>« Tu n'as pas à régler ça toute seule. Si tu veux, je peux être là quand tu en parles à quelqu'un - n'importe quel adulte de confiance. »</w:t>
       </w:r>
       <w:r>
         <w:br/>
@@ -12543,7 +12462,7 @@
           <w:color w:val="999999"/>
           <w:sz w:val="17"/>
         </w:rPr>
-        <w:t>Solidaire. Mais c'est à elle de faire le premier pas — tu le lui rappelles bien.</w:t>
+        <w:t>Solidaire. Mais c'est à elle de faire le premier pas - tu le lui rappelles bien.</w:t>
       </w:r>
       <w:r>
         <w:br/>
@@ -12600,7 +12519,7 @@
           <w:color w:val="999999"/>
           <w:sz w:val="17"/>
         </w:rPr>
-        <w:t>Tu prends tout sur toi. Ce n'est pas ton rôle — et elle sait que ça risque d'empirer.</w:t>
+        <w:t>Tu prends tout sur toi. Ce n'est pas ton rôle - et elle sait que ça risque d'empirer.</w:t>
       </w:r>
       <w:r>
         <w:br/>
@@ -12670,7 +12589,7 @@
         </w:rPr>
         <w:t>Tu as su trouver les mots justes à chaque instant.</w:t>
         <w:br/>
-        <w:t>Ni trop forts, ni trop légers — juste présents.</w:t>
+        <w:t>Ni trop forts, ni trop légers - juste présents.</w:t>
         <w:br/>
         <w:br/>
         <w:t>La tante t'a fait confiance. Clara a raccroché avec une décision concrète : parler à un adulte de confiance, et ne plus porter ça seule.</w:t>
@@ -12696,7 +12615,7 @@
         </w:rPr>
         <w:t>« Je vais en parler à ma tante. Vraiment parler. »</w:t>
         <w:br/>
-        <w:t>— Clara</w:t>
+        <w:t>- Clara</w:t>
       </w:r>
     </w:p>
     <w:p>
@@ -12733,7 +12652,7 @@
         <w:t>Tu as montré de la bonne volonté, même si certaines réponses manquaient de profondeur.</w:t>
         <w:br/>
         <w:br/>
-        <w:t>Clara hésite encore — mais elle envisage d'en parler à un adulte. Le chemin est long.</w:t>
+        <w:t>Clara hésite encore - mais elle envisage d'en parler à un adulte. Le chemin est long.</w:t>
         <w:br/>
         <w:br/>
         <w:t>Ton rôle était de lui montrer que ce n'est pas à elle seule de tout porter.</w:t>
@@ -12756,7 +12675,7 @@
         </w:rPr>
         <w:t>« Peut-être que je vais essayer… »</w:t>
         <w:br/>
-        <w:t>— Clara</w:t>
+        <w:t>- Clara</w:t>
       </w:r>
     </w:p>
     <w:p>
@@ -12793,7 +12712,7 @@
         <w:t>Tu voulais bien faire, mais tes mots ont parfois sonné comme des reproches ou de l'impatience.</w:t>
         <w:br/>
         <w:br/>
-        <w:t>Clara reste fermée. Elle a besoin de temps — et de quelqu'un qui écoute vraiment avant d'agir.</w:t>
+        <w:t>Clara reste fermée. Elle a besoin de temps - et de quelqu'un qui écoute vraiment avant d'agir.</w:t>
       </w:r>
     </w:p>
     <w:p>
@@ -12813,7 +12732,7 @@
         </w:rPr>
         <w:t>« J'avais juste besoin que tu m'écoutes. »</w:t>
         <w:br/>
-        <w:t>— Clara</w:t>
+        <w:t>- Clara</w:t>
       </w:r>
     </w:p>
     <w:p>
@@ -12956,7 +12875,7 @@
         <w:rPr>
           <w:sz w:val="21"/>
         </w:rPr>
-        <w:t>N'a rien réglé tout seul — il a fait ce qu'un ami de quatorze ans peut faire : prévenir quelqu'un qui peut agir.</w:t>
+        <w:t>N'a rien réglé tout seul - il a fait ce qu'un ami de quatorze ans peut faire : prévenir quelqu'un qui peut agir.</w:t>
       </w:r>
     </w:p>
     <w:p>
@@ -12985,7 +12904,7 @@
         <w:t>Le collège a ouvert une enquête et les a reçus, avec leurs parents. Deux ont répondu qu'ils « ne pensaient pas à mal ». Kevin a montré ses captures.</w:t>
         <w:br/>
         <w:br/>
-        <w:t>En France, le harcèlement scolaire est un délit depuis 2022 — y compris en ligne, y compris entre élèves d'un même établissement.</w:t>
+        <w:t>En France, le harcèlement scolaire est un délit depuis 2022 - y compris en ligne, y compris entre élèves d'un même établissement.</w:t>
         <w:br/>
         <w:br/>
         <w:t>Clara est revenue trois semaines plus tard. Ça n'a pas été simple. Mais elle ne portait plus ça toute seule.</w:t>
@@ -13022,7 +12941,7 @@
           <w:color w:val="666666"/>
           <w:sz w:val="20"/>
         </w:rPr>
-        <w:t>Cyberharcèlement — gratuit, anonyme, 7 j/7 (e-Enfance)</w:t>
+        <w:t>Cyberharcèlement - gratuit, anonyme, 7 j/7 (e-Enfance)</w:t>
       </w:r>
     </w:p>
     <w:p>
@@ -13042,7 +12961,7 @@
           <w:color w:val="666666"/>
           <w:sz w:val="20"/>
         </w:rPr>
-        <w:t>Harcèlement à l'école — « Non au harcèlement »</w:t>
+        <w:t>Harcèlement à l'école - « Non au harcèlement »</w:t>
       </w:r>
     </w:p>
     <w:p>
@@ -13096,7 +13015,7 @@
           <w:color w:val="666666"/>
           <w:sz w:val="18"/>
         </w:rPr>
-        <w:t>Ces numéros sont dans ressources.js — c'est le seul fichier à modifier pour adapter le jeu à un autre pays. La version anglaise (ressources_en.js) donne les numéros européens.</w:t>
+        <w:t>Ces numéros sont dans ressources.js - c'est le seul fichier à modifier pour adapter le jeu à un autre pays. La version anglaise (ressources_en.js) donne les numéros européens.</w:t>
       </w:r>
     </w:p>
     <w:p>
@@ -13113,7 +13032,7 @@
           <w:color w:val="AAAAAA"/>
           <w:sz w:val="16"/>
         </w:rPr>
-        <w:t>Retrouver Clara — document produit automatiquement à partir des fichiers du jeu.</w:t>
+        <w:t>Retrouver Clara - document produit automatiquement à partir des fichiers du jeu.</w:t>
       </w:r>
     </w:p>
     <w:sectPr>

</xml_diff>

<commit_message>
Retours testeurs et coherence narrative
- P1 : la conversation « tante » s'ouvre directement au retour (plus de
  script rejoue), deja resolue une fois le numero obtenu ; Ines decouvre
  le « havre secret » en meme temps que Leo (plus de « bravo », plus de
  restaurant : numero de chez la tante).
- Leo et Clara amis depuis la primaire mais plus dans la meme classe.
- P2 : comptes du groupe retires des vieilles photos, message
  « balance le groupe » remplace, story/cours/chronologie coherents,
  message de nuit de @jevoustrouve, transition Sarah -> tante.
- P3 : Kevin « disparu d'un coup », note des comptes corrigee.
- P4 : absence « presque une semaine », parents expliques, repliques
  pivot de la tante remises dans le bon sens ; apercu accueil.
- Legendes accentuees, intro P1 desambiguisee, doc partenaires regenere.

Co-Authored-By: Claude Opus 5.5 <noreply@anthropic.com>
Claude-Session: https://claude.ai/code/session_01Dsj3XZv1AMX7gg2wgSCMWk
</commit_message>
<xml_diff>
--- a/doc_textes_partenaires.docx
+++ b/doc_textes_partenaires.docx
@@ -58,7 +58,7 @@
           <w:color w:val="999999"/>
           <w:sz w:val="16"/>
         </w:rPr>
-        <w:t>Version du 14 septembre 2026  ·  Usage interne</w:t>
+        <w:t>Version du 23 septembre 2026  ·  Usage interne</w:t>
       </w:r>
     </w:p>
     <w:p>
@@ -84,7 +84,7 @@
         <w:rPr>
           <w:sz w:val="21"/>
         </w:rPr>
-        <w:t>Retrouver Clara est un jeu pédagogique destiné aux collégiens sur le thème du harcèlement scolaire et de son prolongement en ligne. Le joueur incarne Léo - ou Léa, au choix - un ami de Clara, quatorze ans, qui ne vient plus au collège depuis cinq jours. En traversant quatre scènes, il reconstitue ce qu'elle a vécu et apprend à lui parler.</w:t>
+        <w:t>Retrouver Clara est un jeu pédagogique destiné aux collégiens sur le thème du harcèlement scolaire et de son prolongement en ligne. Le joueur incarne Léo - ou Léa, au choix - un ami de Clara, quatorze ans, qui ne vient plus au collège depuis presque une semaine. En traversant quatre scènes, il reconstitue ce qu'elle a vécu et apprend à lui parler.</w:t>
       </w:r>
     </w:p>
     <w:p>
@@ -530,7 +530,7 @@
         <w:rPr>
           <w:sz w:val="21"/>
         </w:rPr>
-        <w:t>Inès ?</w:t>
+        <w:t>Inès ?</w:t>
       </w:r>
     </w:p>
     <w:p>
@@ -584,7 +584,7 @@
         <w:rPr>
           <w:sz w:val="21"/>
         </w:rPr>
-        <w:t>C'est Léo. On est dans la même école que Clara.</w:t>
+        <w:t>C'est Léo. Je suis un ami de Clara, depuis la primaire.</w:t>
       </w:r>
     </w:p>
     <w:p>
@@ -638,7 +638,7 @@
         <w:rPr>
           <w:sz w:val="21"/>
         </w:rPr>
-        <w:t>Je sais. J'arrive plus à la joindre depuis plusieurs jours. Je ne la vois plus dans la cour. T'as eu de ses nouvelles ?</w:t>
+        <w:t>Je sais. J'arrive plus à la joindre depuis plusieurs jours. Je ne la vois plus dans la cour. T'as eu de ses nouvelles ?</w:t>
       </w:r>
     </w:p>
     <w:p>
@@ -711,7 +711,7 @@
           <w:color w:val="999999"/>
           <w:sz w:val="18"/>
         </w:rPr>
-        <w:t>Que répond Léo ?</w:t>
+        <w:t>Que répond Léo ?</w:t>
       </w:r>
     </w:p>
     <w:p>
@@ -810,7 +810,7 @@
         <w:rPr>
           <w:sz w:val="20"/>
         </w:rPr>
-        <w:t>Je suis inquiet. J'arrive plus à dormir depuis hier soir.</w:t>
+        <w:t>Je suis inquiet. J'arrive plus à dormir depuis qu'elle a disparu.</w:t>
       </w:r>
       <w:r>
         <w:br/>
@@ -863,7 +863,7 @@
         <w:rPr>
           <w:sz w:val="21"/>
         </w:rPr>
-        <w:t>Tu la connais comment toi, Clara ?</w:t>
+        <w:t>Tu la connais comment toi, Clara ?</w:t>
       </w:r>
     </w:p>
     <w:p>
@@ -881,7 +881,7 @@
           <w:color w:val="2A7A50"/>
           <w:sz w:val="19"/>
         </w:rPr>
-        <w:t>Je la connais depuis quelques années. On se croisait souvent à l'école. Il faut que je le lui montre.</w:t>
+        <w:t>On est amis depuis la primaire. Cette année on n'est plus dans la même classe, on se voyait moins… mais elle compte toujours autant pour moi. Il faut qu'Inès comprenne que je ne suis pas là par curiosité.</w:t>
       </w:r>
     </w:p>
     <w:p>
@@ -895,7 +895,7 @@
           <w:color w:val="999999"/>
           <w:sz w:val="18"/>
         </w:rPr>
-        <w:t>Que répond Léo ?</w:t>
+        <w:t>Que répond Léo ?</w:t>
       </w:r>
     </w:p>
     <w:p>
@@ -920,7 +920,7 @@
         <w:rPr>
           <w:sz w:val="20"/>
         </w:rPr>
-        <w:t>On se croise souvent. Je l'aimais bien.</w:t>
+        <w:t>On est amis depuis la primaire. Elle compte beaucoup pour moi.</w:t>
       </w:r>
       <w:r>
         <w:br/>
@@ -994,7 +994,7 @@
         <w:rPr>
           <w:sz w:val="20"/>
         </w:rPr>
-        <w:t>On est dans des classes différentes mais on se parle des fois.</w:t>
+        <w:t>On se voit moins depuis qu'on est plus dans la même classe.</w:t>
       </w:r>
       <w:r>
         <w:br/>
@@ -1088,7 +1088,7 @@
           <w:color w:val="999999"/>
           <w:sz w:val="18"/>
         </w:rPr>
-        <w:t>Que répond Léo ?</w:t>
+        <w:t>Que répond Léo ?</w:t>
       </w:r>
     </w:p>
     <w:p>
@@ -1113,7 +1113,7 @@
         <w:rPr>
           <w:sz w:val="20"/>
         </w:rPr>
-        <w:t>Ça lui arrivait déjà avant ?</w:t>
+        <w:t>Ça lui arrivait déjà avant ?</w:t>
       </w:r>
       <w:r>
         <w:br/>
@@ -1227,7 +1227,7 @@
         <w:rPr>
           <w:sz w:val="20"/>
         </w:rPr>
-        <w:t>Vous vous parliez souvent ?</w:t>
+        <w:t>Vous vous parliez souvent ?</w:t>
       </w:r>
       <w:r>
         <w:br/>
@@ -1354,7 +1354,7 @@
         <w:rPr>
           <w:sz w:val="21"/>
         </w:rPr>
-        <w:t>Elle manquait des cours. Elle répondait plus aux messages.</w:t>
+        <w:t>Elle manquait des cours. Elle répondait de moins en moins aux messages.</w:t>
       </w:r>
     </w:p>
     <w:p>
@@ -1395,7 +1395,7 @@
           <w:color w:val="999999"/>
           <w:sz w:val="18"/>
         </w:rPr>
-        <w:t>Que répond Léo ?</w:t>
+        <w:t>Que répond Léo ?</w:t>
       </w:r>
     </w:p>
     <w:p>
@@ -1420,7 +1420,7 @@
         <w:rPr>
           <w:sz w:val="20"/>
         </w:rPr>
-        <w:t>Tu sais ce qui s'est passé ?</w:t>
+        <w:t>Tu sais ce qui s'est passé ?</w:t>
       </w:r>
       <w:r>
         <w:br/>
@@ -1477,7 +1477,7 @@
         <w:rPr>
           <w:sz w:val="20"/>
         </w:rPr>
-        <w:t>Et t'as pas essayé d'en parler avec elle ?</w:t>
+        <w:t>Et t'as pas essayé d'en parler avec elle ?</w:t>
       </w:r>
       <w:r>
         <w:br/>
@@ -1534,7 +1534,7 @@
         <w:rPr>
           <w:sz w:val="20"/>
         </w:rPr>
-        <w:t>Elle avait l'air d'avoir peur de quelque chose ?</w:t>
+        <w:t>Elle avait l'air d'avoir peur de quelque chose ?</w:t>
       </w:r>
       <w:r>
         <w:br/>
@@ -1702,7 +1702,7 @@
           <w:color w:val="999999"/>
           <w:sz w:val="18"/>
         </w:rPr>
-        <w:t>Que répond Léo ?</w:t>
+        <w:t>Que répond Léo ?</w:t>
       </w:r>
     </w:p>
     <w:p>
@@ -1913,7 +1913,7 @@
           <w:color w:val="999999"/>
           <w:sz w:val="18"/>
         </w:rPr>
-        <w:t>Que répond Léo ?</w:t>
+        <w:t>Que répond Léo ?</w:t>
       </w:r>
     </w:p>
     <w:p>
@@ -2092,7 +2092,7 @@
         <w:rPr>
           <w:sz w:val="21"/>
         </w:rPr>
-        <w:t>T'es dans quelle classe ?</w:t>
+        <w:t>T'es dans quelle classe ?</w:t>
       </w:r>
     </w:p>
     <w:p>
@@ -2119,7 +2119,7 @@
         <w:rPr>
           <w:sz w:val="21"/>
         </w:rPr>
-        <w:t>Tu connais qui dans la sienne ?</w:t>
+        <w:t>Tu connais qui dans la sienne ?</w:t>
       </w:r>
     </w:p>
     <w:p>
@@ -2133,7 +2133,7 @@
           <w:color w:val="999999"/>
           <w:sz w:val="18"/>
         </w:rPr>
-        <w:t>Comment réagit Léo ?</w:t>
+        <w:t>Comment réagit Léo ?</w:t>
       </w:r>
     </w:p>
     <w:p>
@@ -2430,7 +2430,7 @@
         </w:rPr>
         <w:t>Je sais vraiment pas si je fais bien.</w:t>
         <w:br/>
-        <w:t>Tu me promets de faire attention ?</w:t>
+        <w:t>Tu me promets de faire attention ?</w:t>
       </w:r>
     </w:p>
     <w:p>
@@ -2462,7 +2462,7 @@
         <w:rPr>
           <w:sz w:val="21"/>
         </w:rPr>
-        <w:t>Tu promets de respecter la vie privée de Clara ?</w:t>
+        <w:t>Tu promets de respecter la vie privée de Clara ?</w:t>
       </w:r>
     </w:p>
     <w:p>
@@ -2494,7 +2494,7 @@
         <w:rPr>
           <w:sz w:val="21"/>
         </w:rPr>
-        <w:t>Elle me l'avait donné au cas où. Tu l'utilises, t'en parles à personne.</w:t>
+        <w:t>Elle me l'avait donné au cas où. Tu l'utilises, mais t'en parles à personne.</w:t>
       </w:r>
     </w:p>
     <w:p>
@@ -2560,7 +2560,7 @@
         <w:rPr>
           <w:sz w:val="21"/>
         </w:rPr>
-        <w:t>Tu promets de faire attention à ce que tu lis ?</w:t>
+        <w:t>Tu promets de faire attention à ce que tu lis ?</w:t>
       </w:r>
     </w:p>
     <w:p>
@@ -2608,7 +2608,7 @@
         <w:rPr>
           <w:sz w:val="21"/>
         </w:rPr>
-        <w:t>Tu promets de respecter la vie privée de Clara ?</w:t>
+        <w:t>Tu promets de respecter la vie privée de Clara ?</w:t>
       </w:r>
     </w:p>
     <w:p>
@@ -2640,7 +2640,7 @@
         <w:rPr>
           <w:sz w:val="21"/>
         </w:rPr>
-        <w:t>Elle me l'avait donné au cas où. Tu l'utilises, t'en parles à personne.</w:t>
+        <w:t>Elle me l'avait donné au cas où. Tu l'utilises, mais t'en parles à personne.</w:t>
       </w:r>
     </w:p>
     <w:p>
@@ -2698,7 +2698,7 @@
         <w:rPr>
           <w:sz w:val="21"/>
         </w:rPr>
-        <w:t>Elle s'ouvre quand le joueur revient sur la Partie 1 après avoir lu le groupe Whatsupp. Le joueur écrit librement ; les mots acceptés sont « tante », « campagne », « havre » et « secret ».</w:t>
+        <w:t>Elle s'ouvre quand le joueur revient sur la Partie 1 après avoir lu le groupe Whatsupp (et, une fois le numéro obtenu, elle se réaffiche d'emblée, déjà résolue). Le joueur écrit librement ; les mots acceptés sont « tante », « campagne », « havre » et « secret ».</w:t>
       </w:r>
     </w:p>
     <w:p>
@@ -2725,7 +2725,7 @@
         <w:rPr>
           <w:sz w:val="21"/>
         </w:rPr>
-        <w:t>Inès, j'ai peut-être trouvé quelque chose</w:t>
+        <w:t>Inès, je crois que je sais où est Clara.</w:t>
       </w:r>
     </w:p>
     <w:p>
@@ -2752,7 +2752,19 @@
         <w:rPr>
           <w:sz w:val="21"/>
         </w:rPr>
-        <w:t>quoi donc ?</w:t>
+        <w:t>Quoi ?? Où ça ?</w:t>
+      </w:r>
+    </w:p>
+    <w:p>
+      <w:pPr>
+        <w:jc w:val="left"/>
+        <w:spacing w:before="0" w:after="70" w:line="276" w:lineRule="auto"/>
+      </w:pPr>
+      <w:r>
+        <w:rPr>
+          <w:sz w:val="21"/>
+        </w:rPr>
+        <w:t>Si le joueur parle du « havre secret » :</w:t>
       </w:r>
     </w:p>
     <w:p>
@@ -2779,7 +2791,19 @@
         <w:rPr>
           <w:sz w:val="21"/>
         </w:rPr>
-        <w:t>Oui ! c'est chez sa tante, à la campagne. C'est là qu'elle est, bravo ! Sa tante travaille dans un restaurant - voici le numéro : 04 54 78 95 32</w:t>
+        <w:t>Son « havre secret » ?? C'est comme ça qu'elle appelait la maison de sa tante, à la campagne.</w:t>
+      </w:r>
+    </w:p>
+    <w:p>
+      <w:pPr>
+        <w:jc w:val="left"/>
+        <w:spacing w:before="0" w:after="70" w:line="276" w:lineRule="auto"/>
+      </w:pPr>
+      <w:r>
+        <w:rPr>
+          <w:sz w:val="21"/>
+        </w:rPr>
+        <w:t>S'il parle de la tante ou de la campagne :</w:t>
       </w:r>
     </w:p>
     <w:p>
@@ -2806,7 +2830,61 @@
         <w:rPr>
           <w:sz w:val="21"/>
         </w:rPr>
-        <w:t>Si la réponse ne convient pas : « Je vois pas à quoi tu fais référence... c'est quoi exactement ce que t'as trouvé ? »</w:t>
+        <w:t>Chez sa tante ?? Mais oui… c'est là qu'elle allait quand ça allait pas. Elle appelait ça son « havre secret ».</w:t>
+      </w:r>
+    </w:p>
+    <w:p>
+      <w:pPr>
+        <w:spacing w:before="0" w:after="30" w:line="276" w:lineRule="auto"/>
+        <w:keepLines/>
+      </w:pPr>
+      <w:r>
+        <w:rPr>
+          <w:rFonts w:ascii="Arial Narrow" w:hAnsi="Arial Narrow"/>
+          <w:b/>
+          <w:color w:val="4A1A6A"/>
+          <w:sz w:val="17"/>
+        </w:rPr>
+        <w:t xml:space="preserve">Inès        </w:t>
+      </w:r>
+      <w:r>
+        <w:rPr>
+          <w:sz w:val="16"/>
+        </w:rPr>
+        <w:t xml:space="preserve">  </w:t>
+      </w:r>
+      <w:r>
+        <w:rPr>
+          <w:sz w:val="21"/>
+        </w:rPr>
+        <w:t>J'y avais même pas pensé. J'ai le numéro de chez sa tante, on y était allées ensemble cet été. Attends, je le cherche. 04 54 78 95 32 Appelle-la. Et dis-moi comment va Clara, stp.</w:t>
+      </w:r>
+    </w:p>
+    <w:p>
+      <w:pPr>
+        <w:spacing w:before="0" w:after="30" w:line="276" w:lineRule="auto"/>
+        <w:keepLines/>
+      </w:pPr>
+      <w:r>
+        <w:rPr>
+          <w:rFonts w:ascii="Arial Narrow" w:hAnsi="Arial Narrow"/>
+          <w:b/>
+          <w:color w:val="4A1A6A"/>
+          <w:sz w:val="17"/>
+        </w:rPr>
+        <w:t xml:space="preserve">Inès        </w:t>
+      </w:r>
+      <w:r>
+        <w:rPr>
+          <w:sz w:val="16"/>
+        </w:rPr>
+        <w:t xml:space="preserve">  </w:t>
+      </w:r>
+      <w:r>
+        <w:rPr>
+          <w:sz w:val="21"/>
+        </w:rPr>
+        <w:t>Si la réponse ne convient pas : « Hein ? Je comprends pas. Elle serait où, d'après toi ? »</w:t>
       </w:r>
     </w:p>
     <w:p>
@@ -3305,7 +3383,7 @@
         <w:rPr>
           <w:sz w:val="19"/>
         </w:rPr>
-        <w:t>"t'as vu ta tete ce matin serieusement"</w:t>
+        <w:t>"t'as vu ta tete sur ta derniere photo serieusement"</w:t>
       </w:r>
     </w:p>
     <w:p>
@@ -3331,7 +3409,7 @@
         <w:rPr>
           <w:sz w:val="19"/>
         </w:rPr>
-        <w:t>"franchement fais un effort avant de venir en cours"</w:t>
+        <w:t>"franchement t'as bien fait de plus venir en cours"</w:t>
       </w:r>
     </w:p>
     <w:p>
@@ -3393,7 +3471,7 @@
         <w:rPr>
           <w:sz w:val="19"/>
         </w:rPr>
-        <w:t>"t'as pas honte ?"</w:t>
+        <w:t>"t'as pas honte ?"</w:t>
       </w:r>
     </w:p>
     <w:p>
@@ -3534,7 +3612,7 @@
         <w:rPr>
           <w:sz w:val="19"/>
         </w:rPr>
-        <w:t>"c'est toi qui as balance le groupe et tout le monde le sait"</w:t>
+        <w:t>"on sait tout ce que tu fais clara"</w:t>
       </w:r>
     </w:p>
     <w:p>
@@ -3547,7 +3625,7 @@
         <w:rPr>
           <w:sz w:val="19"/>
         </w:rPr>
-        <w:t>"t'aurais pas du faire ca"</w:t>
+        <w:t>"chaque photo chaque story on voit tout"</w:t>
       </w:r>
     </w:p>
     <w:p>
@@ -3560,7 +3638,7 @@
         <w:rPr>
           <w:sz w:val="19"/>
         </w:rPr>
-        <w:t>"tu crois que ca va rester sans consequence ?"</w:t>
+        <w:t>"tu crois que ca va rester sans consequence ?"</w:t>
       </w:r>
     </w:p>
     <w:p>
@@ -3622,7 +3700,7 @@
         <w:rPr>
           <w:sz w:val="19"/>
         </w:rPr>
-        <w:t>"j'ai screenshotte ta story d'hier"</w:t>
+        <w:t>"j'ai screenshotte ta derniere story avant que tu la supprimes"</w:t>
       </w:r>
     </w:p>
     <w:p>
@@ -3711,7 +3789,7 @@
         <w:rPr>
           <w:sz w:val="19"/>
         </w:rPr>
-        <w:t>"t'as un vrai probleme avec ton poids tu sais ca ?"</w:t>
+        <w:t>"t'as un vrai probleme avec ton poids tu sais ca ?"</w:t>
       </w:r>
     </w:p>
     <w:p>
@@ -3724,7 +3802,7 @@
         <w:rPr>
           <w:sz w:val="19"/>
         </w:rPr>
-        <w:t>"chaque fois qu'on te voit en cours c'est de pire en pire"</w:t>
+        <w:t>"chaque fois qu'on te voyait en cours c'etait de pire en pire"</w:t>
       </w:r>
     </w:p>
     <w:p>
@@ -3737,7 +3815,7 @@
         <w:rPr>
           <w:sz w:val="19"/>
         </w:rPr>
-        <w:t>"t'as pas de miroir chez toi ?"</w:t>
+        <w:t>"t'as pas de miroir chez toi ?"</w:t>
       </w:r>
     </w:p>
     <w:p>
@@ -3799,7 +3877,7 @@
         <w:rPr>
           <w:sz w:val="19"/>
         </w:rPr>
-        <w:t>"la question c'etait : Clara est-elle la personne la plus nulle du college"</w:t>
+        <w:t>"la question c'etait : Clara est-elle la personne la plus nulle du college"</w:t>
       </w:r>
     </w:p>
     <w:p>
@@ -3825,7 +3903,7 @@
         <w:rPr>
           <w:sz w:val="19"/>
         </w:rPr>
-        <w:t>"tu vas arreter de te la peter maintenant ?"</w:t>
+        <w:t>"tu vas arreter de te la peter maintenant ?"</w:t>
       </w:r>
     </w:p>
     <w:p>
@@ -3844,7 +3922,7 @@
           <w:color w:val="2A4A7A"/>
           <w:sz w:val="19"/>
         </w:rPr>
-        <w:t>jevoustrouve</w:t>
+        <w:t>sansnom_2024</w:t>
       </w:r>
       <w:r>
         <w:rPr>
@@ -3852,7 +3930,7 @@
           <w:color w:val="999999"/>
           <w:sz w:val="16"/>
         </w:rPr>
-        <w:t xml:space="preserve">  hier 18h02</w:t>
+        <w:t xml:space="preserve">  hier 16h44</w:t>
       </w:r>
     </w:p>
     <w:p>
@@ -3865,7 +3943,7 @@
         <w:rPr>
           <w:sz w:val="19"/>
         </w:rPr>
-        <w:t>"tes photos sont vraiment nulles arrete de poster"</w:t>
+        <w:t>"t'es tellement sensible ca devient pesant pour tout le monde"</w:t>
       </w:r>
     </w:p>
     <w:p>
@@ -3878,7 +3956,7 @@
         <w:rPr>
           <w:sz w:val="19"/>
         </w:rPr>
-        <w:t>"tu copies le style des autres mais ca rend pas pareil sur toi c'est logique"</w:t>
+        <w:t>"tu pleures pour un rien c'est pathologique"</w:t>
       </w:r>
     </w:p>
     <w:p>
@@ -3891,7 +3969,20 @@
         <w:rPr>
           <w:sz w:val="19"/>
         </w:rPr>
-        <w:t>"desabonne-toi d'insta tu fais honte"</w:t>
+        <w:t>"les autres te supportent plus mais personne veut te le dire en face"</w:t>
+      </w:r>
+    </w:p>
+    <w:p>
+      <w:pPr>
+        <w:spacing w:before="0" w:after="8" w:line="260" w:lineRule="auto"/>
+        <w:ind w:left="400"/>
+        <w:shd w:val="clear" w:color="auto" w:fill="F7F9FD"/>
+      </w:pPr>
+      <w:r>
+        <w:rPr>
+          <w:sz w:val="19"/>
+        </w:rPr>
+        <w:t>"maintenant tu sais"</w:t>
       </w:r>
     </w:p>
     <w:p>
@@ -3910,7 +4001,7 @@
           <w:color w:val="2A4A7A"/>
           <w:sz w:val="19"/>
         </w:rPr>
-        <w:t>sansnom_2024</w:t>
+        <w:t>jevoustrouve</w:t>
       </w:r>
       <w:r>
         <w:rPr>
@@ -3918,7 +4009,16 @@
           <w:color w:val="999999"/>
           <w:sz w:val="16"/>
         </w:rPr>
-        <w:t xml:space="preserve">  hier 16h44</w:t>
+        <w:t xml:space="preserve">  hier 02h47</w:t>
+      </w:r>
+      <w:r>
+        <w:rPr>
+          <w:rFonts w:ascii="Arial" w:hAnsi="Arial"/>
+          <w:i/>
+          <w:color w:val="C09030"/>
+          <w:sz w:val="16"/>
+        </w:rPr>
+        <w:t xml:space="preserve">   [Menaces et intimidation]</w:t>
       </w:r>
     </w:p>
     <w:p>
@@ -3931,7 +4031,7 @@
         <w:rPr>
           <w:sz w:val="19"/>
         </w:rPr>
-        <w:t>"t'es tellement sensible ca devient pesant pour tout le monde"</w:t>
+        <w:t>"tu dors ?"</w:t>
       </w:r>
     </w:p>
     <w:p>
@@ -3944,7 +4044,7 @@
         <w:rPr>
           <w:sz w:val="19"/>
         </w:rPr>
-        <w:t>"tu pleures pour un rien c'est pathologique"</w:t>
+        <w:t>"nous on dort tres bien"</w:t>
       </w:r>
     </w:p>
     <w:p>
@@ -3957,7 +4057,7 @@
         <w:rPr>
           <w:sz w:val="19"/>
         </w:rPr>
-        <w:t>"les autres te supportent plus mais personne veut te le dire en face"</w:t>
+        <w:t>"tu peux eteindre ton tel ca changera rien"</w:t>
       </w:r>
     </w:p>
     <w:p>
@@ -3970,7 +4070,7 @@
         <w:rPr>
           <w:sz w:val="19"/>
         </w:rPr>
-        <w:t>"maintenant tu sais"</w:t>
+        <w:t>"demain on sera encore la"</w:t>
       </w:r>
     </w:p>
     <w:p>
@@ -4112,7 +4212,7 @@
         <w:rPr>
           <w:sz w:val="19"/>
         </w:rPr>
-        <w:t>"tu sais qu'on parle de toi sur le groupe depuis hier soir ?"</w:t>
+        <w:t>"tu sais qu'on parle de toi sur le groupe depuis hier soir ?"</w:t>
       </w:r>
     </w:p>
     <w:p>
@@ -4200,7 +4300,7 @@
         <w:rPr>
           <w:sz w:val="19"/>
         </w:rPr>
-        <w:t>"ta photo a ete partagee dans plusieurs groupes lol"</w:t>
+        <w:t>"ta photo a ete partagee dans plusieurs groupes 💀"</w:t>
       </w:r>
     </w:p>
     <w:p>
@@ -4275,7 +4375,7 @@
         <w:rPr>
           <w:sz w:val="19"/>
         </w:rPr>
-        <w:t>"tes amis te parlent encore par pitie tu le sais non ?"</w:t>
+        <w:t>"tes amis te parlent encore par pitie tu le sais non ?"</w:t>
       </w:r>
     </w:p>
     <w:p>
@@ -4355,7 +4455,7 @@
         <w:rPr>
           <w:sz w:val="19"/>
         </w:rPr>
-        <w:t>"t'as vu ton nombre de likes sur ta derniere photo ?"</w:t>
+        <w:t>"t'as vu ton nombre de likes sur ta derniere photo ?"</w:t>
       </w:r>
     </w:p>
     <w:p>
@@ -4368,7 +4468,7 @@
         <w:rPr>
           <w:sz w:val="19"/>
         </w:rPr>
-        <w:t>"4 likes en 2 heures avec 600 abonnes c'est nul"</w:t>
+        <w:t>"4 likes en 2 heures avec 612 abonnes c'est nul"</w:t>
       </w:r>
     </w:p>
     <w:p>
@@ -4381,7 +4481,7 @@
         <w:rPr>
           <w:sz w:val="19"/>
         </w:rPr>
-        <w:t>"meme tes propres abonnes t'ignorent lol"</w:t>
+        <w:t>"meme tes propres abonnes t'ignorent mdrrr"</w:t>
       </w:r>
     </w:p>
     <w:p>
@@ -4522,7 +4622,7 @@
         <w:rPr>
           <w:sz w:val="19"/>
         </w:rPr>
-        <w:t>"on t'a filmee a la cantine hier t'etais au courant ?"</w:t>
+        <w:t>"on t'a filmee a la cantine hier t'etais au courant ?"</w:t>
       </w:r>
     </w:p>
     <w:p>
@@ -4588,7 +4688,7 @@
         <w:rPr>
           <w:sz w:val="19"/>
         </w:rPr>
-        <w:t>"Clara t'as pas repondu hier soir ca va ?"</w:t>
+        <w:t>"Clara t'as pas repondu hier soir ca va ?"</w:t>
       </w:r>
     </w:p>
     <w:p>
@@ -4823,6 +4923,19 @@
           <w:sz w:val="19"/>
         </w:rPr>
         <w:t>"du coup je lui fais croire que tout va bien"</w:t>
+      </w:r>
+    </w:p>
+    <w:p>
+      <w:pPr>
+        <w:spacing w:before="0" w:after="8" w:line="260" w:lineRule="auto"/>
+        <w:ind w:left="400"/>
+        <w:shd w:val="clear" w:color="auto" w:fill="F7F9FD"/>
+      </w:pPr>
+      <w:r>
+        <w:rPr>
+          <w:sz w:val="19"/>
+        </w:rPr>
+        <w:t>"mais un weekend ca suffira pas"</w:t>
       </w:r>
     </w:p>
     <w:p>
@@ -5064,7 +5177,7 @@
         <w:rPr>
           <w:sz w:val="19"/>
         </w:rPr>
-        <w:t>"t'as vu le commentaire que E. a laisse sur ta photo ?"</w:t>
+        <w:t>"t'as vu le commentaire que E. a laisse sur ta photo ?"</w:t>
       </w:r>
     </w:p>
     <w:p>
@@ -5153,7 +5266,7 @@
         <w:rPr>
           <w:sz w:val="19"/>
         </w:rPr>
-        <w:t>"personne ne t'a defendue quand M. t'a insultee tu l'as remarque ?"</w:t>
+        <w:t>"personne ne t'a defendue quand M. t'a insultee tu l'as remarque ?"</w:t>
       </w:r>
     </w:p>
     <w:p>
@@ -5228,7 +5341,7 @@
         <w:rPr>
           <w:sz w:val="19"/>
         </w:rPr>
-        <w:t>"t'as vu les stories que les 3emes ont postees sur toi ?"</w:t>
+        <w:t>"t'as vu les stories que les 3emes ont postees sur toi ?"</w:t>
       </w:r>
     </w:p>
     <w:p>
@@ -5307,7 +5420,7 @@
         <w:rPr>
           <w:sz w:val="19"/>
         </w:rPr>
-        <w:t>"ton ex a tout raconte a ses potes tu savais ?"</w:t>
+        <w:t>"ton ex a tout raconte a ses potes tu savais ?"</w:t>
       </w:r>
     </w:p>
     <w:p>
@@ -5421,7 +5534,7 @@
         <w:rPr>
           <w:sz w:val="19"/>
         </w:rPr>
-        <w:t>"t'as compris le message ?"</w:t>
+        <w:t>"t'as compris le message ?"</w:t>
       </w:r>
     </w:p>
     <w:p>
@@ -5475,7 +5588,7 @@
         <w:rPr>
           <w:sz w:val="19"/>
         </w:rPr>
-        <w:t>"t'arrives encore a dormir la nuit sachant que tout le monde te deteste ?"</w:t>
+        <w:t>"t'arrives encore a dormir la nuit sachant que tout le monde te deteste ?"</w:t>
       </w:r>
     </w:p>
     <w:p>
@@ -5824,7 +5937,7 @@
         <w:rPr>
           <w:sz w:val="19"/>
         </w:rPr>
-        <w:t>"on t'a invente un surnom dans la classe tu veux savoir lequel ?"</w:t>
+        <w:t>"on t'a invente un surnom dans la classe tu veux savoir lequel ?"</w:t>
       </w:r>
     </w:p>
     <w:p>
@@ -6058,7 +6171,7 @@
           <w:color w:val="2A4A7A"/>
           <w:sz w:val="19"/>
         </w:rPr>
-        <w:t>Photo 2 - trop aimer jouer 🎸🎵</w:t>
+        <w:t>Photo 2 - j'ai adoré jouer ce soir 🎸🎵</w:t>
       </w:r>
       <w:r>
         <w:rPr>
@@ -6224,7 +6337,7 @@
         <w:rPr>
           <w:sz w:val="19"/>
         </w:rPr>
-        <w:t>anonymous_x0 - mange encore t'inquiete</w:t>
+        <w:t>xX_shadow_Xx - mange encore t'inquiete</w:t>
       </w:r>
     </w:p>
     <w:p>
@@ -6264,7 +6377,7 @@
         <w:rPr>
           <w:sz w:val="19"/>
         </w:rPr>
-        <w:t>ines_l - t'es a quel tome la ??</w:t>
+        <w:t>ines_l - t'es a quel tome la ??</w:t>
       </w:r>
     </w:p>
     <w:p>
@@ -6317,7 +6430,7 @@
         <w:rPr>
           <w:sz w:val="19"/>
         </w:rPr>
-        <w:t>vrai_info_colleg - quoi ? tu aimes cette artiste ? t'es nulle ma pauvre fille</w:t>
+        <w:t>explosif_2024 - quoi ? tu aimes cette artiste ? t'es nulle ma pauvre fille</w:t>
       </w:r>
     </w:p>
     <w:p>
@@ -6362,7 +6475,7 @@
           <w:color w:val="2A4A7A"/>
           <w:sz w:val="19"/>
         </w:rPr>
-        <w:t>Photo 7 - fleurs du marche 🌸</w:t>
+        <w:t>Photo 7 - fleurs du marché 🌸</w:t>
       </w:r>
       <w:r>
         <w:rPr>
@@ -6396,7 +6509,7 @@
         <w:rPr>
           <w:sz w:val="19"/>
         </w:rPr>
-        <w:t>fantome_reseau - des fleurs ? personne t'en offrira jamais lol</w:t>
+        <w:t>fantome_reseau - des fleurs ? personne t'en offrira jamais 💀</w:t>
       </w:r>
     </w:p>
     <w:p>
@@ -6415,7 +6528,7 @@
           <w:color w:val="2A4A7A"/>
           <w:sz w:val="19"/>
         </w:rPr>
-        <w:t>Photo 8 - gateau d'anniversaire 🎂</w:t>
+        <w:t>Photo 8 - gâteau d'anniversaire 🎂</w:t>
       </w:r>
       <w:r>
         <w:rPr>
@@ -6436,7 +6549,7 @@
         <w:rPr>
           <w:sz w:val="19"/>
         </w:rPr>
-        <w:t>anon_colleg_real - personne etait la pour ton anniversaire c'est ca ?</w:t>
+        <w:t>anon_colleg_real - personne etait la pour ton anniversaire c'est ca ?</w:t>
       </w:r>
     </w:p>
     <w:p>
@@ -6449,7 +6562,7 @@
         <w:rPr>
           <w:sz w:val="19"/>
         </w:rPr>
-        <w:t>sansnom_2024 - tu l'as mange toute seule le gateau ?</w:t>
+        <w:t>sansnom_2024 - tu l'as mange toute seule le gateau ?</w:t>
       </w:r>
     </w:p>
     <w:p>
@@ -6481,7 +6594,7 @@
           <w:color w:val="2A4A7A"/>
           <w:sz w:val="19"/>
         </w:rPr>
-        <w:t>Photo 9 - nuit etoilee 🌙</w:t>
+        <w:t>Photo 9 - nuit étoilée 🌙</w:t>
       </w:r>
       <w:r>
         <w:rPr>
@@ -6515,7 +6628,7 @@
         <w:rPr>
           <w:sz w:val="19"/>
         </w:rPr>
-        <w:t>utilisateur_4729 - meme le ciel il veut pas de toi</w:t>
+        <w:t>void_user_xx - meme le ciel il veut pas de toi</w:t>
       </w:r>
     </w:p>
     <w:p>
@@ -6528,7 +6641,7 @@
         <w:rPr>
           <w:sz w:val="19"/>
         </w:rPr>
-        <w:t>_noreply_ghost_ - t'aurais mieux fait de dormir que de poster ca</w:t>
+        <w:t>froid_comme_toi - t'aurais mieux fait de dormir que de poster ca</w:t>
       </w:r>
     </w:p>
     <w:p>
@@ -6591,7 +6704,7 @@
         <w:rPr>
           <w:sz w:val="21"/>
         </w:rPr>
-        <w:t>Ces messages ("on est plusieurs à t'avoir à l'œil") représentent quelle forme de cyberharcèlement ?</w:t>
+        <w:t>Ces messages ("on est plusieurs à t'avoir à l'œil") représentent quelle forme de cyberharcèlement ?</w:t>
       </w:r>
     </w:p>
     <w:p>
@@ -6698,7 +6811,7 @@
         <w:rPr>
           <w:sz w:val="21"/>
         </w:rPr>
-        <w:t>"Clara est-elle la personne la plus nulle du collège ?" - Quel type de cyberharcèlement est-ce ?</w:t>
+        <w:t>"Clara est-elle la personne la plus nulle du collège ?" - Quel type de cyberharcèlement est-ce ?</w:t>
       </w:r>
     </w:p>
     <w:p>
@@ -6805,7 +6918,7 @@
         <w:rPr>
           <w:sz w:val="21"/>
         </w:rPr>
-        <w:t>"On parle de toi en mal mais je ne te dirai pas ce qu'on dit." - C'est quoi ?</w:t>
+        <w:t>"On parle de toi en mal mais je ne te dirai pas ce qu'on dit." - C'est quoi ?</w:t>
       </w:r>
     </w:p>
     <w:p>
@@ -6912,7 +7025,7 @@
         <w:rPr>
           <w:sz w:val="21"/>
         </w:rPr>
-        <w:t>"Supprime ton compte, personne ne le remarquerait." - Quel mécanisme est à l'œuvre ?</w:t>
+        <w:t>"Supprime ton compte, personne ne le remarquerait." - Quel mécanisme est à l'œuvre ?</w:t>
       </w:r>
     </w:p>
     <w:p>
@@ -6984,7 +7097,7 @@
           <w:color w:val="666666"/>
           <w:sz w:val="19"/>
         </w:rPr>
-        <w:t>Pousser la victime à s'auto-exclure, c'est de l'exclusion forcée. L'objectif : faire disparaître la personne sans que le harceleur soit directement tenu responsable.</w:t>
+        <w:t>Pousser la victime à s'auto-exclure, c'est de l'exclusion forcée. L'objectif : faire disparaître la personne sans que le harceleur soit directement tenu responsable.</w:t>
       </w:r>
     </w:p>
     <w:p>
@@ -7019,7 +7132,7 @@
         <w:rPr>
           <w:sz w:val="21"/>
         </w:rPr>
-        <w:t>"J'ai créé ce compte rien que pour te dire que t'es nulle." Quel est le danger spécifique ?</w:t>
+        <w:t>"J'ai créé ce compte rien que pour te dire que t'es nulle." Quel est le danger spécifique ?</w:t>
       </w:r>
     </w:p>
     <w:p>
@@ -7126,7 +7239,7 @@
         <w:rPr>
           <w:sz w:val="21"/>
         </w:rPr>
-        <w:t>À ton avis, comment appelle-t-on le genre de commentaire que tu viens de lire sous la photo ?</w:t>
+        <w:t>À ton avis, comment appelle-t-on le genre de commentaire que tu viens de lire sous la photo ?</w:t>
       </w:r>
     </w:p>
     <w:p>
@@ -7233,7 +7346,7 @@
         <w:rPr>
           <w:sz w:val="21"/>
         </w:rPr>
-        <w:t>Des inconnus commentent la photo de Clara au concert en disant qu'elle "n'était pas à sa place" et que "les gens autour d'elle devaient être contents". C'est quoi ?</w:t>
+        <w:t>Des inconnus commentent la photo de Clara au concert en disant qu'elle "n'était pas à sa place" et que "les gens autour d'elle devaient être contents". C'est quoi ?</w:t>
       </w:r>
     </w:p>
     <w:p>
@@ -7324,7 +7437,7 @@
           <w:color w:val="2A4A7A"/>
           <w:sz w:val="20"/>
         </w:rPr>
-        <w:t>photo « gateau d'anniversaire 🎂 »</w:t>
+        <w:t>photo « gâteau d'anniversaire 🎂 »</w:t>
       </w:r>
     </w:p>
     <w:p>
@@ -7340,7 +7453,7 @@
         <w:rPr>
           <w:sz w:val="21"/>
         </w:rPr>
-        <w:t>Les commentaires sur la photo d'anniversaire de Clara la raillent sur sa solitude ("personne était là ?", "tu l'as mangé toute seule ?"). C'est quel type de harcèlement ?</w:t>
+        <w:t>Les commentaires sur la photo d'anniversaire de Clara la raillent sur sa solitude ("personne était là ?", "tu l'as mangé toute seule ?"). C'est quel type de harcèlement ?</w:t>
       </w:r>
     </w:p>
     <w:p>
@@ -7595,7 +7708,7 @@
         <w:t>Ils écrivent à Clara depuis des comptes anonymes - et ici, entre eux, ils disent lesquels.</w:t>
         <w:br/>
         <w:br/>
-        <w:t>À chaque fois qu'un compte est nommé, appuie dessus : je saurai qui se cache derrière. Clara, elle, ne le saura jamais.</w:t>
+        <w:t>À chaque fois qu'un compte est nommé, appuie dessus : je saurai qui se cache derrière. Clara, elle, ne le saura jamais.</w:t>
         <w:br/>
         <w:br/>
         <w:t>Il y en a cinq à repérer. Des questions viendront aussi pendant la lecture.</w:t>
@@ -7880,7 +7993,7 @@
         <w:rPr>
           <w:sz w:val="21"/>
         </w:rPr>
-        <w:t>ça fait combien de temps qu'on lui parle plus au fait ?</w:t>
+        <w:t>ça fait combien de temps qu'on lui parle plus au fait ?</w:t>
       </w:r>
     </w:p>
     <w:p>
@@ -8205,7 +8318,7 @@
         <w:rPr>
           <w:sz w:val="21"/>
         </w:rPr>
-        <w:t>moi j'utilise @utilisateur_4729, ça fait un moment</w:t>
+        <w:t>moi j'utilise @utilisateur_4729</w:t>
       </w:r>
     </w:p>
     <w:p>
@@ -8382,7 +8495,7 @@
         <w:rPr>
           <w:sz w:val="21"/>
         </w:rPr>
-        <w:t>regardez son nombre de likes 💀 3 likes en 2h avec 600 abonnés c'est mort</w:t>
+        <w:t>regardez son nombre de likes 💀 3 likes en 2h avec 612 abonnés c'est mort</w:t>
       </w:r>
     </w:p>
     <w:p>
@@ -8544,7 +8657,7 @@
         <w:rPr>
           <w:sz w:val="21"/>
         </w:rPr>
-        <w:t>et aussi ses DMs ? on pourrait lui envoyer des trucs la nuit</w:t>
+        <w:t>et aussi ses DMs ? on pourrait lui envoyer des trucs la nuit</w:t>
       </w:r>
     </w:p>
     <w:p>
@@ -8633,7 +8746,7 @@
         <w:rPr>
           <w:sz w:val="21"/>
         </w:rPr>
-        <w:t>Kevin hésite mais se tait et accepte. Que révèle cette scène ?</w:t>
+        <w:t>Kevin hésite mais se tait et accepte. Que révèle cette scène ?</w:t>
       </w:r>
     </w:p>
     <w:p>
@@ -8759,7 +8872,7 @@
         <w:rPr>
           <w:sz w:val="21"/>
         </w:rPr>
-        <w:t>moi c'est @vrai_info_colleg, créé pour balancer des rumeurs sur elle</w:t>
+        <w:t>et j'en ai fait un 2e : @vrai_info_colleg, pour balancer des rumeurs sur elle</w:t>
       </w:r>
     </w:p>
     <w:p>
@@ -8813,7 +8926,7 @@
         <w:rPr>
           <w:sz w:val="21"/>
         </w:rPr>
-        <w:t>pour ce soir on s'organise : messages toutes les heures après minuit</w:t>
+        <w:t>pour ce soir on s'organise : messages toutes les heures après minuit</w:t>
       </w:r>
     </w:p>
     <w:p>
@@ -8902,7 +9015,7 @@
         <w:rPr>
           <w:sz w:val="21"/>
         </w:rPr>
-        <w:t>Pourquoi créent-ils des comptes anonymes spécifiquement pour harceler Clara ?</w:t>
+        <w:t>Pourquoi créent-ils des comptes anonymes spécifiquement pour harceler Clara ?</w:t>
       </w:r>
     </w:p>
     <w:p>
@@ -9016,7 +9129,7 @@
         <w:rPr>
           <w:sz w:val="21"/>
         </w:rPr>
-        <w:t>vous avez vu ? Clara a plus posté depuis hier soir</w:t>
+        <w:t>vous avez vu ? Clara a plus posté depuis hier soir</w:t>
       </w:r>
     </w:p>
     <w:p>
@@ -9178,7 +9291,7 @@
         <w:rPr>
           <w:sz w:val="21"/>
         </w:rPr>
-        <w:t>ça fait 2 jours qu'on la voit plus nulle part. c'est pas normal</w:t>
+        <w:t>elle a disparu de partout d'un coup. c'est pas normal</w:t>
       </w:r>
     </w:p>
     <w:p>
@@ -9723,7 +9836,7 @@
         <w:rPr>
           <w:sz w:val="21"/>
         </w:rPr>
-        <w:t>s'est enfuie vers son « havre secret »... mais où est-il ?</w:t>
+        <w:t>s'est enfuie vers son « havre secret »... mais où est-il ?</w:t>
       </w:r>
     </w:p>
     <w:p>
@@ -9833,7 +9946,7 @@
         <w:rPr>
           <w:sz w:val="19"/>
         </w:rPr>
-        <w:t>Le harcèlement est planifié, réparti dans le temps pour paraître naturel. Ce n'est pas spontané : c'est une organisation invisible. La victime perçoit une hostilité généralisée sans en voir la source.</w:t>
+        <w:t>Le harcèlement est planifié, réparti dans le temps pour paraître naturel. Ce n'est pas spontané : c'est une organisation invisible. La victime perçoit une hostilité généralisée sans en voir la source.</w:t>
       </w:r>
     </w:p>
     <w:p>
@@ -9875,7 +9988,7 @@
           <w:color w:val="666666"/>
           <w:sz w:val="20"/>
         </w:rPr>
-        <w:t>🫥 Et Kevin ?</w:t>
+        <w:t>🫥 Et Kevin ?</w:t>
       </w:r>
     </w:p>
     <w:p>
@@ -9887,7 +10000,7 @@
         <w:rPr>
           <w:sz w:val="21"/>
         </w:rPr>
-        <w:t>Kevin a douté quatre fois. « On va un peu trop loin là. » « C'est peut-être grave. » « Ça fait 2 jours qu'on la voit plus. » Puis « … ». À chaque fois on lui a coupé la parole, et à chaque fois il s'est tu. Il a fini par écrire à Clara, mais trop tard : elle était déjà partie.</w:t>
+        <w:t>Kevin a douté cinq fois. « On va un peu trop loin là. » « C'est peut-être grave. » « Elle a disparu de partout d'un coup. » « On est peut-être allés trop loin. » Puis « … ». À chaque fois on lui a coupé la parole, et à chaque fois il s'est tu. Il a fini par écrire à Clara, mais trop tard : elle était déjà partie.</w:t>
       </w:r>
     </w:p>
     <w:p>
@@ -9907,7 +10020,7 @@
         <w:rPr>
           <w:sz w:val="21"/>
         </w:rPr>
-        <w:t>Écrire à Clara en privé dès le premier doute, une seule phrase. Il n'avait pas besoin d'affronter le groupe : il suffisait qu'elle ne se croie plus seule.</w:t>
+        <w:t>Écrire à Clara en privé dès le premier doute, une seule phrase. Il n'avait pas besoin d'affronter le groupe : il suffisait qu'elle ne se croie plus seule.</w:t>
       </w:r>
     </w:p>
     <w:p>
@@ -9995,7 +10108,7 @@
           <w:color w:val="666666"/>
           <w:sz w:val="20"/>
         </w:rPr>
-        <w:t>❓ Pourquoi Clara ?</w:t>
+        <w:t>❓ Pourquoi Clara ?</w:t>
       </w:r>
     </w:p>
     <w:p>
@@ -10007,7 +10120,7 @@
         <w:rPr>
           <w:sz w:val="21"/>
         </w:rPr>
-        <w:t>Relis le groupe : à aucun moment ils ne le disent. La seule justification qui revient est « elle l'a bien cherché ». Il n'y a pas de raison - et chercher laquelle serait déjà donner tort à Clara.</w:t>
+        <w:t>Relis le groupe : à aucun moment ils ne le disent. La seule justification qui revient est « elle l'a bien cherché ». Il n'y a pas de raison - et chercher laquelle serait déjà donner tort à Clara.</w:t>
       </w:r>
     </w:p>
     <w:p>
@@ -10048,7 +10161,7 @@
         <w:rPr>
           <w:sz w:val="21"/>
         </w:rPr>
-        <w:t>Clara ne vient plus au collège depuis cinq jours. Elle s'est réfugiée chez sa tante, à la campagne.</w:t>
+        <w:t>Clara ne vient plus au collège depuis presque une semaine. Elle s'est réfugiée chez sa tante, à la campagne.</w:t>
         <w:br/>
         <w:t>Tu es Léo, son ami. Pour parler à Clara, tu dois d'abord convaincre sa tante que tu es digne de confiance - et que tu es vraiment là pour l'aider.</w:t>
       </w:r>
@@ -10220,7 +10333,7 @@
         <w:rPr>
           <w:sz w:val="21"/>
         </w:rPr>
-        <w:t>Allô ?</w:t>
+        <w:t>Allô ?</w:t>
       </w:r>
     </w:p>
     <w:p>
@@ -10247,7 +10360,7 @@
         <w:rPr>
           <w:sz w:val="21"/>
         </w:rPr>
-        <w:t>Bonjour madame… excusez-moi de vous déranger. Je m'appelle Léo, je suis un ami de Clara. Est-ce que je pourrais lui parler, s'il vous plaît ?</w:t>
+        <w:t>Bonjour madame… excusez-moi de vous déranger. Je m'appelle Léo, je suis un ami de Clara. Est-ce que je pourrais lui parler, s'il vous plaît ?</w:t>
       </w:r>
     </w:p>
     <w:p>
@@ -10276,7 +10389,7 @@
         </w:rPr>
         <w:t>Léo… Oui, elle m'a parlé de toi.</w:t>
         <w:br/>
-        <w:t>Mais… je préfère être honnête : ce n'est pas un bon moment.</w:t>
+        <w:t>Mais… je préfère être honnête : ce n'est pas un bon moment.</w:t>
       </w:r>
     </w:p>
     <w:p>
@@ -10290,7 +10403,7 @@
           <w:color w:val="999999"/>
           <w:sz w:val="18"/>
         </w:rPr>
-        <w:t>Comment répondre ?</w:t>
+        <w:t>Comment répondre ?</w:t>
       </w:r>
     </w:p>
     <w:p>
@@ -10461,7 +10574,7 @@
           <w:color w:val="666666"/>
           <w:sz w:val="18"/>
         </w:rPr>
-        <w:t>(froid) Urgent… pour toi, peut-être.</w:t>
+        <w:t>(froide) Urgent… pour toi, peut-être.</w:t>
       </w:r>
     </w:p>
     <w:p>
@@ -10636,7 +10749,7 @@
           <w:color w:val="999999"/>
           <w:sz w:val="18"/>
         </w:rPr>
-        <w:t>Que réponds-tu ?</w:t>
+        <w:t>Que réponds-tu ?</w:t>
       </w:r>
     </w:p>
     <w:p>
@@ -10661,7 +10774,7 @@
         <w:rPr>
           <w:sz w:val="20"/>
         </w:rPr>
-        <w:t>« Elle culpabilise ? Mais elle a rien fait… C'est ça qui me fait le plus mal. »</w:t>
+        <w:t>« Elle culpabilise ? Mais elle a rien fait… C'est ça qui me fait le plus mal. »</w:t>
       </w:r>
       <w:r>
         <w:br/>
@@ -10923,7 +11036,7 @@
           <w:color w:val="666666"/>
           <w:sz w:val="18"/>
         </w:rPr>
-        <w:t>(froid) Éviter ça. Tu penses vraiment que c'était si simple.</w:t>
+        <w:t>(froide) Éviter ça. Tu penses vraiment que c'était si simple.</w:t>
       </w:r>
     </w:p>
     <w:p>
@@ -11197,7 +11310,7 @@
         <w:rPr>
           <w:sz w:val="20"/>
         </w:rPr>
-        <w:t>Est-ce que tu comprends la différence, Léo ?</w:t>
+        <w:t>Est-ce que tu comprends la différence, Léo ?</w:t>
       </w:r>
     </w:p>
     <w:p>
@@ -11382,7 +11495,7 @@
         <w:rPr>
           <w:sz w:val="21"/>
         </w:rPr>
-        <w:t>Allô… ?</w:t>
+        <w:t>Allô… ?</w:t>
       </w:r>
     </w:p>
     <w:p>
@@ -11571,7 +11684,7 @@
         <w:rPr>
           <w:sz w:val="21"/>
         </w:rPr>
-        <w:t>Pourquoi tu n'as rien dit ? Tu sais que tu pouvais me parler…</w:t>
+        <w:t>Pourquoi tu n'as rien dit ? Tu sais que tu pouvais me parler…</w:t>
       </w:r>
     </w:p>
     <w:p>
@@ -11614,7 +11727,7 @@
           <w:color w:val="999999"/>
           <w:sz w:val="18"/>
         </w:rPr>
-        <w:t>Que lui réponds-tu ?</w:t>
+        <w:t>Que lui réponds-tu ?</w:t>
       </w:r>
     </w:p>
     <w:p>
@@ -11753,7 +11866,7 @@
         <w:rPr>
           <w:sz w:val="20"/>
         </w:rPr>
-        <w:t>« Pourquoi tu as supprimé ces messages ? J'aurais répondu, tu sais. »</w:t>
+        <w:t>« Pourquoi tu as supprimé ces messages ? J'aurais répondu, tu sais. »</w:t>
       </w:r>
       <w:r>
         <w:br/>
@@ -11848,7 +11961,7 @@
           <w:color w:val="999999"/>
           <w:sz w:val="18"/>
         </w:rPr>
-        <w:t>Que ressens-tu à l'entendre ?</w:t>
+        <w:t>Que ressens-tu à l'entendre ?</w:t>
       </w:r>
     </w:p>
     <w:p>
@@ -12019,7 +12132,7 @@
           <w:color w:val="666666"/>
           <w:sz w:val="18"/>
         </w:rPr>
-        <w:t>(froid) Merci, j'y avais pas pensé.</w:t>
+        <w:t>(froide) Merci, j'y avais pas pensé.</w:t>
       </w:r>
     </w:p>
     <w:p>
@@ -12060,7 +12173,7 @@
         <w:rPr>
           <w:sz w:val="21"/>
         </w:rPr>
-        <w:t>Le pire, tu sais quoi ?</w:t>
+        <w:t>Le pire, tu sais quoi ?</w:t>
         <w:br/>
         <w:t>C'est quand j'ai commencé à y croire.</w:t>
         <w:br/>
@@ -12078,7 +12191,7 @@
           <w:color w:val="999999"/>
           <w:sz w:val="18"/>
         </w:rPr>
-        <w:t>Comment lui répondre ?</w:t>
+        <w:t>Comment lui répondre ?</w:t>
       </w:r>
     </w:p>
     <w:p>
@@ -12323,7 +12436,7 @@
         <w:rPr>
           <w:sz w:val="21"/>
         </w:rPr>
-        <w:t>Tu en as parlé à ta tante ? À tes parents ?</w:t>
+        <w:t>Tu en as parlé à ta tante ? À tes parents ?</w:t>
       </w:r>
     </w:p>
     <w:p>
@@ -12350,7 +12463,9 @@
         <w:rPr>
           <w:sz w:val="21"/>
         </w:rPr>
-        <w:t>Ma tante sait un peu… Elle est gentille. Mais je veux pas les inquiéter.</w:t>
+        <w:t>Mes parents croient que c'est juste de la fatigue. Ils ont dit au collège que j'étais malade.</w:t>
+        <w:br/>
+        <w:t>Ma tante, elle, sait un peu… Elle est gentille. Mais je veux pas les inquiéter.</w:t>
         <w:br/>
         <w:t>J'ai l'impression que si j'en parle vraiment… ça devient réel.</w:t>
       </w:r>
@@ -12366,7 +12481,7 @@
           <w:color w:val="999999"/>
           <w:sz w:val="18"/>
         </w:rPr>
-        <w:t>Que lui dire ?</w:t>
+        <w:t>Que lui dire ?</w:t>
       </w:r>
     </w:p>
     <w:p>
@@ -12391,7 +12506,7 @@
         <w:rPr>
           <w:sz w:val="20"/>
         </w:rPr>
-        <w:t>« C'est déjà réel, Clara. Et c'est pour ça qu'il faut des adultes qui peuvent agir : ta tante, tes parents, le CPE. Pas pour tout régler d'un coup. Juste pour que tu portes plus ça toute seule. »</w:t>
+        <w:t>« C'est déjà réel, Clara. Et c'est pour ça qu'il faut des adultes qui peuvent agir : ta tante, tes parents, le CPE. Pas pour tout régler d'un coup. Juste pour que tu portes plus ça toute seule. »</w:t>
       </w:r>
       <w:r>
         <w:br/>
@@ -12539,7 +12654,7 @@
           <w:color w:val="666666"/>
           <w:sz w:val="18"/>
         </w:rPr>
-        <w:t>(froid) Non… s'il te plaît, fais rien. Ça va juste empirer.</w:t>
+        <w:t>(froide) Non… s'il te plaît, fais rien. Ça va juste empirer.</w:t>
       </w:r>
     </w:p>
     <w:p>
@@ -12592,7 +12707,7 @@
         <w:t>Ni trop forts, ni trop légers - juste présents.</w:t>
         <w:br/>
         <w:br/>
-        <w:t>La tante t'a fait confiance. Clara a raccroché avec une décision concrète : parler à un adulte de confiance, et ne plus porter ça seule.</w:t>
+        <w:t>La tante t'a fait confiance. Clara a raccroché avec une décision concrète : parler à un adulte de confiance, et ne plus porter ça seule.</w:t>
         <w:br/>
         <w:br/>
         <w:t>Ton rôle n'était pas de la sauver. C'était de lui montrer que demander de l'aide, c'est possible.</w:t>
@@ -12835,7 +12950,7 @@
         <w:rPr>
           <w:sz w:val="21"/>
         </w:rPr>
-        <w:t>Va voir le CPE. Pas pour dénoncer : pour dire qu'une élève de son collège ne vient plus, et pourquoi.</w:t>
+        <w:t>Va voir le CPE. Pas pour dénoncer : pour dire qu'une élève de son collège ne vient plus, et pourquoi.</w:t>
       </w:r>
     </w:p>
     <w:p>
@@ -12875,7 +12990,7 @@
         <w:rPr>
           <w:sz w:val="21"/>
         </w:rPr>
-        <w:t>N'a rien réglé tout seul - il a fait ce qu'un ami de quatorze ans peut faire : prévenir quelqu'un qui peut agir.</w:t>
+        <w:t>N'a rien réglé tout seul - il a fait ce qu'un ami de quatorze ans peut faire : prévenir quelqu'un qui peut agir.</w:t>
       </w:r>
     </w:p>
     <w:p>
@@ -12889,7 +13004,7 @@
           <w:color w:val="444444"/>
           <w:sz w:val="20"/>
         </w:rPr>
-        <w:t>⚖️ ET LES CINQ DU GROUPE ?</w:t>
+        <w:t>⚖️ ET LES CINQ DU GROUPE ?</w:t>
       </w:r>
     </w:p>
     <w:p>

</xml_diff>